<commit_message>
update manuscript and WBS
</commit_message>
<xml_diff>
--- a/Manuscript/Manuscript_V03.docx
+++ b/Manuscript/Manuscript_V03.docx
@@ -46,6 +46,19 @@
         </w:p>
       </w:sdtContent>
     </w:sdt>
+    <w:p>
+      <w:pPr>
+        <w:pStyle w:val="Normal"/>
+        <w:rPr>
+          <w:rFonts w:ascii="Arial" w:hAnsi="Arial" w:cs="Arial"/>
+        </w:rPr>
+      </w:pPr>
+      <w:r>
+        <w:rPr>
+          <w:rFonts w:cs="Arial" w:ascii="Arial" w:hAnsi="Arial"/>
+        </w:rPr>
+      </w:r>
+    </w:p>
     <w:p>
       <w:pPr>
         <w:pStyle w:val="Normal"/>
@@ -1042,8 +1055,24 @@
         <w:rPr>
           <w:rFonts w:cs="Arial" w:ascii="Arial" w:hAnsi="Arial"/>
         </w:rPr>
-        <w:t>1.1 Negative Control Samples Collection</w:t>
-      </w:r>
+        <w:t xml:space="preserve">1.1 </w:t>
+      </w:r>
+      <w:del w:id="2" w:author="Linh Dang" w:date="2026-07-08T10:57:43Z">
+        <w:r>
+          <w:rPr>
+            <w:rFonts w:cs="Arial" w:ascii="Arial" w:hAnsi="Arial"/>
+          </w:rPr>
+          <w:delText>Negative Control Samples Collection</w:delText>
+        </w:r>
+      </w:del>
+      <w:ins w:id="3" w:author="Linh Dang" w:date="2026-07-08T10:57:46Z">
+        <w:r>
+          <w:rPr>
+            <w:rFonts w:cs="Arial" w:ascii="Arial" w:hAnsi="Arial"/>
+          </w:rPr>
+          <w:t>Negative controls (NCTs) were collected at every step of the pipeline</w:t>
+        </w:r>
+      </w:ins>
     </w:p>
     <w:p>
       <w:pPr>
@@ -1066,24 +1095,8 @@
         <w:rPr>
           <w:rFonts w:cs="Arial" w:ascii="Arial" w:hAnsi="Arial"/>
         </w:rPr>
-        <w:t>Fig. 1.</w:t>
-      </w:r>
-      <w:ins w:id="2" w:author="Unknown Author" w:date="2026-05-29T09:51:12Z">
-        <w:r>
-          <w:rPr>
-            <w:rFonts w:cs="Arial" w:ascii="Arial" w:hAnsi="Arial"/>
-          </w:rPr>
-          <w:t>A</w:t>
-        </w:r>
-      </w:ins>
-      <w:ins w:id="3" w:author="Unknown Author" w:date="2026-05-29T10:14:32Z">
-        <w:r>
-          <w:rPr>
-            <w:rFonts w:cs="Arial" w:ascii="Arial" w:hAnsi="Arial"/>
-          </w:rPr>
-          <w:t>, upper panel</w:t>
-        </w:r>
-      </w:ins>
+        <w:t>Fig. 1.A, upper panel</w:t>
+      </w:r>
       <w:r>
         <w:rPr>
           <w:rFonts w:cs="Arial" w:ascii="Arial" w:hAnsi="Arial"/>
@@ -1205,7 +1218,9 @@
       </w:del>
       <w:del w:id="10" w:author="Unknown Author" w:date="2026-05-29T09:20:21Z">
         <w:r>
-          <w:rPr/>
+          <w:rPr>
+            <w:rFonts w:cs="Arial" w:ascii="Arial" w:hAnsi="Arial"/>
+          </w:rPr>
           <w:commentReference w:id="7"/>
         </w:r>
       </w:del>
@@ -1518,7 +1533,7 @@
           <w:rPr>
             <w:rFonts w:cs="Arial" w:ascii="Arial" w:hAnsi="Arial"/>
           </w:rPr>
-          <w:t>A, low</w:t>
+          <w:t>A, lo</w:t>
         </w:r>
       </w:ins>
       <w:ins w:id="44" w:author="Unknown Author" w:date="2026-05-29T10:14:39Z">
@@ -1527,7 +1542,7 @@
           <w:rPr>
             <w:rFonts w:cs="Arial" w:ascii="Arial" w:hAnsi="Arial"/>
           </w:rPr>
-          <w:t>er panel</w:t>
+          <w:t>wer panel</w:t>
         </w:r>
       </w:ins>
       <w:del w:id="45" w:author="Unknown Author" w:date="2026-05-29T09:51:32Z">
@@ -1540,7 +1555,9 @@
       </w:del>
       <w:del w:id="46" w:author="Unknown Author" w:date="2026-05-29T09:51:32Z">
         <w:r>
-          <w:rPr/>
+          <w:rPr>
+            <w:rFonts w:cs="Arial" w:ascii="Arial" w:hAnsi="Arial"/>
+          </w:rPr>
           <w:commentReference w:id="8"/>
         </w:r>
       </w:del>
@@ -1566,6 +1583,7 @@
         <w:jc w:val="both"/>
         <w:rPr>
           <w:rFonts w:ascii="Arial" w:hAnsi="Arial" w:cs="Arial"/>
+          <w:ins w:id="56" w:author="Linh Dang" w:date="2026-07-08T15:00:00Z"/>
         </w:rPr>
       </w:pPr>
       <w:r>
@@ -1582,95 +1600,264 @@
           <w:delText xml:space="preserve">Diversity of </w:delText>
         </w:r>
       </w:del>
-      <w:ins w:id="49" w:author="Linh Dang" w:date="2026-07-07T10:43:51Z">
-        <w:r>
-          <w:rPr>
-            <w:rFonts w:cs="Arial" w:ascii="Arial" w:hAnsi="Arial"/>
-          </w:rPr>
-          <w:t xml:space="preserve">Different </w:t>
+      <w:del w:id="49" w:author="Linh Dang" w:date="2026-07-07T10:45:23Z">
+        <w:r>
+          <w:rPr>
+            <w:rFonts w:cs="Arial" w:ascii="Arial" w:hAnsi="Arial"/>
+          </w:rPr>
+          <w:delText>N</w:delText>
+        </w:r>
+      </w:del>
+      <w:del w:id="50" w:author="Linh Dang" w:date="2026-07-08T11:25:24Z">
+        <w:r>
+          <w:rPr>
+            <w:rFonts w:cs="Arial" w:ascii="Arial" w:hAnsi="Arial"/>
+          </w:rPr>
+          <w:delText xml:space="preserve">egative </w:delText>
+        </w:r>
+      </w:del>
+      <w:del w:id="51" w:author="Linh Dang" w:date="2026-07-07T10:45:27Z">
+        <w:r>
+          <w:rPr>
+            <w:rFonts w:cs="Arial" w:ascii="Arial" w:hAnsi="Arial"/>
+          </w:rPr>
+          <w:delText>C</w:delText>
+        </w:r>
+      </w:del>
+      <w:del w:id="52" w:author="Linh Dang" w:date="2026-07-08T11:25:24Z">
+        <w:r>
+          <w:rPr>
+            <w:rFonts w:cs="Arial" w:ascii="Arial" w:hAnsi="Arial"/>
+          </w:rPr>
+          <w:delText>ontrol</w:delText>
+        </w:r>
+      </w:del>
+      <w:del w:id="53" w:author="Linh Dang" w:date="2026-07-07T10:44:00Z">
+        <w:r>
+          <w:rPr>
+            <w:rFonts w:cs="Arial" w:ascii="Arial" w:hAnsi="Arial"/>
+          </w:rPr>
+          <w:delText>s</w:delText>
+        </w:r>
+      </w:del>
+      <w:ins w:id="54" w:author="Linh Dang" w:date="2026-07-08T14:58:50Z">
+        <w:r>
+          <w:rPr>
+            <w:rFonts w:cs="Arial" w:ascii="Arial" w:hAnsi="Arial"/>
+          </w:rPr>
+          <w:t xml:space="preserve">Different negative control types </w:t>
         </w:r>
       </w:ins>
-      <w:ins w:id="50" w:author="Linh Dang" w:date="2026-07-07T10:45:23Z">
-        <w:r>
-          <w:rPr>
-            <w:rFonts w:cs="Arial" w:ascii="Arial" w:hAnsi="Arial"/>
-          </w:rPr>
-          <w:t>n</w:t>
+      <w:ins w:id="55" w:author="Linh Dang" w:date="2026-07-08T15:00:00Z">
+        <w:r>
+          <w:rPr>
+            <w:rFonts w:cs="Arial" w:ascii="Arial" w:hAnsi="Arial"/>
+          </w:rPr>
+          <w:t>harbor distinct contaminant profiles</w:t>
         </w:r>
       </w:ins>
-      <w:del w:id="51" w:author="Linh Dang" w:date="2026-07-07T10:45:23Z">
-        <w:r>
-          <w:rPr>
-            <w:rFonts w:cs="Arial" w:ascii="Arial" w:hAnsi="Arial"/>
-          </w:rPr>
-          <w:delText>N</w:delText>
-        </w:r>
-      </w:del>
-      <w:r>
-        <w:rPr>
-          <w:rFonts w:cs="Arial" w:ascii="Arial" w:hAnsi="Arial"/>
-        </w:rPr>
-        <w:t xml:space="preserve">egative </w:t>
-      </w:r>
-      <w:ins w:id="52" w:author="Linh Dang" w:date="2026-07-07T10:45:28Z">
-        <w:r>
-          <w:rPr>
-            <w:rFonts w:cs="Arial" w:ascii="Arial" w:hAnsi="Arial"/>
-          </w:rPr>
-          <w:t>c</w:t>
+    </w:p>
+    <w:p>
+      <w:pPr>
+        <w:pStyle w:val="BodyText"/>
+        <w:spacing w:lineRule="auto" w:line="480"/>
+        <w:jc w:val="both"/>
+        <w:rPr>
+          <w:rFonts w:ascii="Arial" w:hAnsi="Arial" w:cs="Arial"/>
+        </w:rPr>
+      </w:pPr>
+      <w:ins w:id="57" w:author="Linh Dang" w:date="2026-07-08T15:26:21Z">
+        <w:r>
+          <w:rPr>
+            <w:rFonts w:cs="Arial" w:ascii="Arial" w:hAnsi="Arial"/>
+          </w:rPr>
+          <w:t xml:space="preserve">According to alpha analyses, there is no significant differences regarding the number of observed species among </w:t>
         </w:r>
       </w:ins>
-      <w:del w:id="53" w:author="Linh Dang" w:date="2026-07-07T10:45:27Z">
-        <w:r>
-          <w:rPr>
-            <w:rFonts w:cs="Arial" w:ascii="Arial" w:hAnsi="Arial"/>
-          </w:rPr>
-          <w:delText>C</w:delText>
-        </w:r>
-      </w:del>
-      <w:r>
-        <w:rPr>
-          <w:rFonts w:cs="Arial" w:ascii="Arial" w:hAnsi="Arial"/>
-        </w:rPr>
-        <w:t>ontrol</w:t>
-      </w:r>
-      <w:del w:id="54" w:author="Linh Dang" w:date="2026-07-07T10:44:00Z">
-        <w:r>
-          <w:rPr>
-            <w:rFonts w:cs="Arial" w:ascii="Arial" w:hAnsi="Arial"/>
-          </w:rPr>
-          <w:delText>s</w:delText>
-        </w:r>
-      </w:del>
-      <w:ins w:id="55" w:author="Linh Dang" w:date="2026-07-07T10:44:03Z">
-        <w:r>
-          <w:rPr>
-            <w:rFonts w:cs="Arial" w:ascii="Arial" w:hAnsi="Arial"/>
-          </w:rPr>
-          <w:t xml:space="preserve"> Types h</w:t>
+      <w:ins w:id="58" w:author="Linh Dang" w:date="2026-07-08T15:27:24Z">
+        <w:r>
+          <w:rPr>
+            <w:rFonts w:cs="Arial" w:ascii="Arial" w:hAnsi="Arial"/>
+          </w:rPr>
+          <w:t xml:space="preserve">different control types. </w:t>
         </w:r>
       </w:ins>
-      <w:ins w:id="56" w:author="Linh Dang" w:date="2026-07-07T10:44:03Z">
-        <w:r>
-          <w:rPr>
-            <w:rFonts w:eastAsia="" w:cs="Arial" w:ascii="Arial" w:hAnsi="Arial" w:eastAsiaTheme="majorEastAsia"/>
-            <w:i/>
-            <w:iCs/>
-            <w:color w:themeColor="accent1" w:themeShade="bf" w:val="0F4761"/>
+      <w:ins w:id="59" w:author="Linh Dang" w:date="2026-07-08T15:32:06Z">
+        <w:r>
+          <w:rPr>
+            <w:rFonts w:eastAsia="Aptos" w:cs="Arial" w:ascii="Arial" w:hAnsi="Arial" w:eastAsiaTheme="minorHAnsi"/>
+            <w:color w:val="auto"/>
             <w:kern w:val="0"/>
             <w:sz w:val="24"/>
             <w:szCs w:val="24"/>
             <w:lang w:val="en-US" w:eastAsia="en-US" w:bidi="ar-SA"/>
           </w:rPr>
-          <w:t>arbor</w:t>
+          <w:t>Notably</w:t>
         </w:r>
       </w:ins>
-      <w:ins w:id="57" w:author="Linh Dang" w:date="2026-07-07T10:44:03Z">
-        <w:r>
-          <w:rPr>
-            <w:rFonts w:cs="Arial" w:ascii="Arial" w:hAnsi="Arial"/>
-          </w:rPr>
-          <w:t xml:space="preserve"> their own contaminant profiles</w:t>
+      <w:ins w:id="60" w:author="Linh Dang" w:date="2026-07-08T15:32:06Z">
+        <w:r>
+          <w:rPr>
+            <w:rFonts w:cs="Arial" w:ascii="Arial" w:hAnsi="Arial"/>
+          </w:rPr>
+          <w:t xml:space="preserve">, Shannon index in buffer control type </w:t>
+        </w:r>
+      </w:ins>
+      <w:ins w:id="61" w:author="Linh Dang" w:date="2026-07-08T15:33:09Z">
+        <w:r>
+          <w:rPr>
+            <w:rFonts w:cs="Arial" w:ascii="Arial" w:hAnsi="Arial"/>
+          </w:rPr>
+          <w:t xml:space="preserve">is significantly greater than one in paraffin controls </w:t>
+        </w:r>
+      </w:ins>
+      <w:ins w:id="62" w:author="Linh Dang" w:date="2026-07-08T15:33:09Z">
+        <w:r>
+          <w:rPr>
+            <w:rFonts w:cs="Arial" w:ascii="Arial" w:hAnsi="Arial"/>
+          </w:rPr>
+          <w:t>(p-value &lt; 1e-3)</w:t>
+        </w:r>
+      </w:ins>
+      <w:ins w:id="63" w:author="Linh Dang" w:date="2026-07-08T15:33:09Z">
+        <w:r>
+          <w:rPr>
+            <w:rFonts w:cs="Arial" w:ascii="Arial" w:hAnsi="Arial"/>
+          </w:rPr>
+          <w:t xml:space="preserve">, suggesting </w:t>
+        </w:r>
+      </w:ins>
+      <w:ins w:id="64" w:author="Linh Dang" w:date="2026-07-08T15:37:24Z">
+        <w:r>
+          <w:rPr>
+            <w:rFonts w:cs="Arial" w:ascii="Arial" w:hAnsi="Arial"/>
+          </w:rPr>
+          <w:t>more</w:t>
+        </w:r>
+      </w:ins>
+      <w:ins w:id="65" w:author="Linh Dang" w:date="2026-07-08T15:34:16Z">
+        <w:r>
+          <w:rPr>
+            <w:rFonts w:cs="Arial" w:ascii="Arial" w:hAnsi="Arial"/>
+          </w:rPr>
+          <w:t xml:space="preserve"> </w:t>
+        </w:r>
+      </w:ins>
+      <w:ins w:id="66" w:author="Linh Dang" w:date="2026-07-08T15:34:16Z">
+        <w:r>
+          <w:rPr>
+            <w:rFonts w:eastAsia="Aptos" w:cs="Arial" w:ascii="Arial" w:hAnsi="Arial" w:eastAsiaTheme="minorHAnsi"/>
+            <w:color w:val="auto"/>
+            <w:kern w:val="0"/>
+            <w:sz w:val="24"/>
+            <w:szCs w:val="24"/>
+            <w:lang w:val="en-US" w:eastAsia="en-US" w:bidi="ar-SA"/>
+          </w:rPr>
+          <w:t>evenness</w:t>
+        </w:r>
+      </w:ins>
+      <w:ins w:id="67" w:author="Linh Dang" w:date="2026-07-08T15:34:16Z">
+        <w:r>
+          <w:rPr>
+            <w:rFonts w:cs="Arial" w:ascii="Arial" w:hAnsi="Arial"/>
+          </w:rPr>
+          <w:t xml:space="preserve"> distributed of taxa in the first type </w:t>
+        </w:r>
+      </w:ins>
+      <w:ins w:id="68" w:author="Linh Dang" w:date="2026-07-08T15:34:16Z">
+        <w:r>
+          <w:rPr>
+            <w:rFonts w:cs="Arial" w:ascii="Arial" w:hAnsi="Arial"/>
+          </w:rPr>
+          <w:t>(Figure 1.</w:t>
+        </w:r>
+      </w:ins>
+      <w:ins w:id="69" w:author="Linh Dang" w:date="2026-07-08T15:34:16Z">
+        <w:r>
+          <w:rPr>
+            <w:rFonts w:cs="Arial" w:ascii="Arial" w:hAnsi="Arial"/>
+          </w:rPr>
+          <w:t>B</w:t>
+        </w:r>
+      </w:ins>
+      <w:ins w:id="70" w:author="Linh Dang" w:date="2026-07-08T15:34:16Z">
+        <w:r>
+          <w:rPr>
+            <w:rFonts w:cs="Arial" w:ascii="Arial" w:hAnsi="Arial"/>
+          </w:rPr>
+          <w:t>)</w:t>
+        </w:r>
+      </w:ins>
+      <w:ins w:id="71" w:author="Linh Dang" w:date="2026-07-08T15:34:16Z">
+        <w:r>
+          <w:rPr>
+            <w:rFonts w:cs="Arial" w:ascii="Arial" w:hAnsi="Arial"/>
+          </w:rPr>
+          <w:t xml:space="preserve">. </w:t>
+        </w:r>
+      </w:ins>
+      <w:ins w:id="72" w:author="Linh Dang" w:date="2026-07-08T15:37:30Z">
+        <w:r>
+          <w:rPr>
+            <w:rFonts w:cs="Arial" w:ascii="Arial" w:hAnsi="Arial"/>
+          </w:rPr>
+          <w:t xml:space="preserve">Nevertheless, </w:t>
+        </w:r>
+      </w:ins>
+      <w:ins w:id="73" w:author="Linh Dang" w:date="2026-07-08T15:43:11Z">
+        <w:r>
+          <w:rPr>
+            <w:rFonts w:cs="Arial" w:ascii="Arial" w:hAnsi="Arial"/>
+          </w:rPr>
+          <w:t>when the statistical test accounting for LP</w:t>
+        </w:r>
+      </w:ins>
+      <w:ins w:id="74" w:author="Linh Dang" w:date="2026-07-08T15:44:14Z">
+        <w:r>
+          <w:rPr>
+            <w:rFonts w:cs="Arial" w:ascii="Arial" w:hAnsi="Arial"/>
+          </w:rPr>
+          <w:t xml:space="preserve">, </w:t>
+        </w:r>
+      </w:ins>
+      <w:ins w:id="75" w:author="Linh Dang" w:date="2026-07-08T15:51:06Z">
+        <w:r>
+          <w:rPr>
+            <w:rFonts w:cs="Arial" w:ascii="Arial" w:hAnsi="Arial"/>
+          </w:rPr>
+          <w:t xml:space="preserve">there is n more significantly different (p-value = 0.25), suggesting that LP </w:t>
+        </w:r>
+      </w:ins>
+      <w:ins w:id="76" w:author="Linh Dang" w:date="2026-07-08T15:52:13Z">
+        <w:r>
+          <w:rPr>
+            <w:rFonts w:cs="Arial" w:ascii="Arial" w:hAnsi="Arial"/>
+          </w:rPr>
+          <w:t>batch effect may contribute a major role in the contaminant profile.</w:t>
+        </w:r>
+      </w:ins>
+      <w:ins w:id="77" w:author="Linh Dang" w:date="2026-07-08T15:58:23Z">
+        <w:r>
+          <w:rPr>
+            <w:rFonts w:cs="Arial" w:ascii="Arial" w:hAnsi="Arial"/>
+          </w:rPr>
+          <w:t xml:space="preserve"> </w:t>
+        </w:r>
+      </w:ins>
+      <w:ins w:id="78" w:author="Linh Dang" w:date="2026-07-08T18:39:33Z">
+        <w:r>
+          <w:rPr>
+            <w:rFonts w:cs="Arial" w:ascii="Arial" w:hAnsi="Arial"/>
+          </w:rPr>
+          <w:t xml:space="preserve">Furthermore, beta diversity reveals that NCT samples are heavily clustering with respect to control types, even </w:t>
+        </w:r>
+      </w:ins>
+      <w:ins w:id="79" w:author="Linh Dang" w:date="2026-07-08T18:40:40Z">
+        <w:r>
+          <w:rPr>
+            <w:rFonts w:cs="Arial" w:ascii="Arial" w:hAnsi="Arial"/>
+          </w:rPr>
+          <w:t xml:space="preserve">after accounting for LP batch effect (Figure 1.C and Supp sheet T1). </w:t>
         </w:r>
       </w:ins>
     </w:p>
@@ -1681,9 +1868,10 @@
         <w:jc w:val="both"/>
         <w:rPr>
           <w:rFonts w:ascii="Arial" w:hAnsi="Arial" w:cs="Arial"/>
-        </w:rPr>
-      </w:pPr>
-      <w:del w:id="58" w:author="Unknown Author" w:date="2026-05-29T10:08:32Z">
+          <w:ins w:id="102" w:author="Linh Dang" w:date="2026-07-08T14:58:17Z"/>
+        </w:rPr>
+      </w:pPr>
+      <w:del w:id="80" w:author="Unknown Author" w:date="2026-05-29T10:08:32Z">
         <w:r>
           <w:rPr>
             <w:rFonts w:cs="Arial" w:ascii="Arial" w:hAnsi="Arial"/>
@@ -1691,13 +1879,13 @@
           <w:delText xml:space="preserve">Intra-sample </w:delText>
         </w:r>
       </w:del>
-      <w:del w:id="59" w:author="Unknown Author" w:date="2026-05-29T10:08:32Z">
+      <w:del w:id="81" w:author="Unknown Author" w:date="2026-05-29T10:08:32Z">
         <w:r>
           <w:rPr/>
           <w:commentReference w:id="9"/>
         </w:r>
       </w:del>
-      <w:del w:id="60" w:author="Unknown Author" w:date="2026-05-29T10:08:32Z">
+      <w:del w:id="82" w:author="Unknown Author" w:date="2026-05-29T10:08:32Z">
         <w:r>
           <w:rPr>
             <w:rFonts w:cs="Arial" w:ascii="Arial" w:hAnsi="Arial"/>
@@ -1705,31 +1893,31 @@
           <w:delText xml:space="preserve">and inter-sample </w:delText>
         </w:r>
       </w:del>
-      <w:del w:id="61" w:author="Unknown Author" w:date="2026-05-29T10:08:32Z">
+      <w:del w:id="83" w:author="Unknown Author" w:date="2026-05-29T10:08:32Z">
         <w:r>
           <w:rPr/>
           <w:commentReference w:id="10"/>
         </w:r>
       </w:del>
-      <w:del w:id="62" w:author="Unknown Author" w:date="2026-05-29T10:08:32Z">
+      <w:del w:id="84" w:author="Unknown Author" w:date="2026-05-29T10:08:32Z">
         <w:r>
           <w:rPr/>
           <w:commentReference w:id="11"/>
         </w:r>
       </w:del>
-      <w:del w:id="63" w:author="Unknown Author" w:date="2026-05-29T10:08:32Z">
+      <w:del w:id="85" w:author="Unknown Author" w:date="2026-05-29T10:08:32Z">
         <w:r>
           <w:rPr/>
           <w:commentReference w:id="12"/>
         </w:r>
       </w:del>
-      <w:del w:id="64" w:author="Unknown Author" w:date="2026-05-29T10:08:32Z">
+      <w:del w:id="86" w:author="Unknown Author" w:date="2026-05-29T10:08:32Z">
         <w:r>
           <w:rPr/>
           <w:commentReference w:id="13"/>
         </w:r>
       </w:del>
-      <w:del w:id="65" w:author="Unknown Author" w:date="2026-05-29T10:08:32Z">
+      <w:del w:id="87" w:author="Unknown Author" w:date="2026-05-29T10:08:32Z">
         <w:r>
           <w:rPr>
             <w:rFonts w:cs="Arial" w:ascii="Arial" w:hAnsi="Arial"/>
@@ -1737,29 +1925,25 @@
           <w:delText>differences in microbial diversity</w:delText>
         </w:r>
       </w:del>
-      <w:ins w:id="66" w:author="Unknown Author" w:date="2026-05-29T10:08:39Z">
-        <w:r>
-          <w:rPr>
-            <w:rFonts w:cs="Arial" w:ascii="Arial" w:hAnsi="Arial"/>
-          </w:rPr>
-          <w:t>Microbial alpha and beta diversities</w:t>
-        </w:r>
+      <w:ins w:id="88" w:author="Unknown Author" w:date="2026-05-29T10:08:39Z">
+        <w:del w:id="89" w:author="Linh Dang" w:date="2026-07-08T11:29:23Z">
+          <w:r>
+            <w:rPr>
+              <w:rFonts w:cs="Arial" w:ascii="Arial" w:hAnsi="Arial"/>
+            </w:rPr>
+            <w:delText>Microbial alpha and beta diversities</w:delText>
+          </w:r>
+        </w:del>
       </w:ins>
-      <w:r>
-        <w:rPr>
-          <w:rFonts w:cs="Arial" w:ascii="Arial" w:hAnsi="Arial"/>
-        </w:rPr>
-        <w:t xml:space="preserve"> were observed across control types (Figures. 1.</w:t>
-      </w:r>
-      <w:ins w:id="67" w:author="Linh Dang" w:date="2026-06-03T12:52:05Z">
-        <w:r>
-          <w:rPr>
-            <w:rFonts w:cs="Arial" w:ascii="Arial" w:hAnsi="Arial"/>
-          </w:rPr>
-          <w:t>B</w:t>
-        </w:r>
-      </w:ins>
-      <w:del w:id="68" w:author="Linh Dang" w:date="2026-06-03T12:52:04Z">
+      <w:del w:id="90" w:author="Linh Dang" w:date="2026-07-08T11:29:23Z">
+        <w:r>
+          <w:rPr>
+            <w:rFonts w:cs="Arial" w:ascii="Arial" w:hAnsi="Arial"/>
+          </w:rPr>
+          <w:delText xml:space="preserve"> were observed across control types (Figures. 1.</w:delText>
+        </w:r>
+      </w:del>
+      <w:del w:id="91" w:author="Linh Dang" w:date="2026-06-03T12:52:04Z">
         <w:r>
           <w:rPr>
             <w:rFonts w:cs="Arial" w:ascii="Arial" w:hAnsi="Arial"/>
@@ -1767,21 +1951,15 @@
           <w:delText>2</w:delText>
         </w:r>
       </w:del>
-      <w:r>
-        <w:rPr>
-          <w:rFonts w:cs="Arial" w:ascii="Arial" w:hAnsi="Arial"/>
-        </w:rPr>
-        <w:t xml:space="preserve"> and 1.</w:t>
-      </w:r>
-      <w:ins w:id="69" w:author="Linh Dang" w:date="2026-06-03T12:52:10Z">
-        <w:r>
-          <w:rPr>
-            <w:rFonts w:cs="Arial" w:ascii="Arial" w:hAnsi="Arial"/>
-          </w:rPr>
-          <w:t>C</w:t>
-        </w:r>
-      </w:ins>
-      <w:del w:id="70" w:author="Linh Dang" w:date="2026-06-03T12:52:09Z">
+      <w:del w:id="92" w:author="Linh Dang" w:date="2026-07-08T11:29:23Z">
+        <w:r>
+          <w:rPr>
+            <w:rFonts w:cs="Arial" w:ascii="Arial" w:hAnsi="Arial"/>
+          </w:rPr>
+          <w:delText xml:space="preserve"> and 1.</w:delText>
+        </w:r>
+      </w:del>
+      <w:del w:id="93" w:author="Linh Dang" w:date="2026-06-03T12:52:09Z">
         <w:r>
           <w:rPr>
             <w:rFonts w:cs="Arial" w:ascii="Arial" w:hAnsi="Arial"/>
@@ -1789,20 +1967,15 @@
           <w:delText>3</w:delText>
         </w:r>
       </w:del>
-      <w:r>
-        <w:rPr>
-          <w:rFonts w:cs="Arial" w:ascii="Arial" w:hAnsi="Arial"/>
-        </w:rPr>
-        <w:t xml:space="preserve">). </w:t>
-      </w:r>
-      <w:commentRangeStart w:id="14"/>
-      <w:r>
-        <w:rPr>
-          <w:rFonts w:cs="Arial" w:ascii="Arial" w:hAnsi="Arial"/>
-        </w:rPr>
-        <w:t xml:space="preserve">Buffer controls exhibited significantly higher species richness and evenness compared to paraffin and PCR controls, as measured by </w:t>
-      </w:r>
-      <w:del w:id="71" w:author="Linh Dang" w:date="2026-07-06T18:14:02Z">
+      <w:del w:id="94" w:author="Linh Dang" w:date="2026-07-08T11:29:23Z">
+        <w:r>
+          <w:rPr>
+            <w:rFonts w:cs="Arial" w:ascii="Arial" w:hAnsi="Arial"/>
+          </w:rPr>
+          <w:delText xml:space="preserve">). Buffer controls exhibited significantly higher species richness and evenness compared to paraffin and PCR controls, as measured by </w:delText>
+        </w:r>
+      </w:del>
+      <w:del w:id="95" w:author="Linh Dang" w:date="2026-07-06T18:14:02Z">
         <w:r>
           <w:rPr>
             <w:rFonts w:cs="Arial" w:ascii="Arial" w:hAnsi="Arial"/>
@@ -1810,57 +1983,56 @@
           <w:delText xml:space="preserve">observed species count, </w:delText>
         </w:r>
       </w:del>
-      <w:r>
-        <w:rPr>
-          <w:rFonts w:cs="Arial" w:ascii="Arial" w:hAnsi="Arial"/>
-        </w:rPr>
-        <w:t>Shannon index, and inverse Simpson index</w:t>
-      </w:r>
-      <w:r>
-        <w:rPr>
-          <w:rFonts w:cs="Arial" w:ascii="Arial" w:hAnsi="Arial"/>
-        </w:rPr>
-      </w:r>
-      <w:commentRangeEnd w:id="14"/>
-      <w:r>
-        <w:commentReference w:id="14"/>
-      </w:r>
-      <w:r>
-        <w:rPr>
-          <w:rFonts w:cs="Arial" w:ascii="Arial" w:hAnsi="Arial"/>
-        </w:rPr>
-        <w:t xml:space="preserve">. </w:t>
-      </w:r>
-      <w:commentRangeStart w:id="15"/>
-      <w:r>
-        <w:rPr>
-          <w:rFonts w:cs="Arial" w:ascii="Arial" w:hAnsi="Arial"/>
-        </w:rPr>
-        <w:t xml:space="preserve">Analogous patterns were observed when stratifying by LP, year, and season (Supplementary Figures </w:t>
-      </w:r>
-      <w:r>
-        <w:rPr>
-          <w:rFonts w:cs="Arial" w:ascii="Arial" w:hAnsi="Arial"/>
-          <w:b/>
-          <w:bCs/>
-        </w:rPr>
-        <w:t>S1.xxx, S1.xxx</w:t>
-      </w:r>
-      <w:r>
-        <w:rPr>
-          <w:rFonts w:cs="Arial" w:ascii="Arial" w:hAnsi="Arial"/>
-        </w:rPr>
-        <w:t>), suggesting pervasive batch structure in the contaminant pool.</w:t>
-      </w:r>
-      <w:commentRangeEnd w:id="15"/>
-      <w:r>
-        <w:commentReference w:id="15"/>
-      </w:r>
-      <w:r>
-        <w:rPr>
-          <w:rFonts w:cs="Arial" w:ascii="Arial" w:hAnsi="Arial"/>
-        </w:rPr>
-      </w:r>
+      <w:del w:id="96" w:author="Linh Dang" w:date="2026-07-08T11:29:23Z">
+        <w:r>
+          <w:rPr>
+            <w:rFonts w:cs="Arial" w:ascii="Arial" w:hAnsi="Arial"/>
+          </w:rPr>
+          <w:delText>Shannon index, and inverse Simpson index</w:delText>
+        </w:r>
+      </w:del>
+      <w:del w:id="97" w:author="Linh Dang" w:date="2026-07-08T11:29:23Z">
+        <w:r>
+          <w:rPr>
+            <w:rFonts w:cs="Arial" w:ascii="Arial" w:hAnsi="Arial"/>
+          </w:rPr>
+          <w:commentReference w:id="14"/>
+        </w:r>
+      </w:del>
+      <w:del w:id="98" w:author="Linh Dang" w:date="2026-07-08T11:29:23Z">
+        <w:r>
+          <w:rPr>
+            <w:rFonts w:cs="Arial" w:ascii="Arial" w:hAnsi="Arial"/>
+          </w:rPr>
+          <w:delText xml:space="preserve">. Analogous patterns were observed when stratifying by LP, year, and season (Supplementary Figures </w:delText>
+        </w:r>
+      </w:del>
+      <w:del w:id="99" w:author="Linh Dang" w:date="2026-07-08T11:29:23Z">
+        <w:r>
+          <w:rPr>
+            <w:rFonts w:cs="Arial" w:ascii="Arial" w:hAnsi="Arial"/>
+            <w:b/>
+            <w:bCs/>
+          </w:rPr>
+          <w:delText>S1.xxx, S1.xxx</w:delText>
+        </w:r>
+      </w:del>
+      <w:del w:id="100" w:author="Linh Dang" w:date="2026-07-08T11:29:23Z">
+        <w:r>
+          <w:rPr>
+            <w:rFonts w:cs="Arial" w:ascii="Arial" w:hAnsi="Arial"/>
+          </w:rPr>
+          <w:delText>), suggesting pervasive batch structure in the contaminant pool.</w:delText>
+        </w:r>
+      </w:del>
+      <w:del w:id="101" w:author="Linh Dang" w:date="2026-07-08T11:29:23Z">
+        <w:r>
+          <w:rPr>
+            <w:rFonts w:cs="Arial" w:ascii="Arial" w:hAnsi="Arial"/>
+          </w:rPr>
+          <w:commentReference w:id="15"/>
+        </w:r>
+      </w:del>
     </w:p>
     <w:p>
       <w:pPr>
@@ -1869,10 +2041,23 @@
         <w:jc w:val="both"/>
         <w:rPr>
           <w:rFonts w:ascii="Arial" w:hAnsi="Arial" w:cs="Arial"/>
-          <w:del w:id="73" w:author="Linh Dang" w:date="2026-06-03T14:00:24Z"/>
-        </w:rPr>
-      </w:pPr>
-      <w:del w:id="72" w:author="Linh Dang" w:date="2026-06-03T14:00:24Z">
+        </w:rPr>
+      </w:pPr>
+      <w:r>
+        <w:rPr/>
+      </w:r>
+    </w:p>
+    <w:p>
+      <w:pPr>
+        <w:pStyle w:val="BodyText"/>
+        <w:spacing w:lineRule="auto" w:line="480"/>
+        <w:jc w:val="both"/>
+        <w:rPr>
+          <w:rFonts w:ascii="Arial" w:hAnsi="Arial" w:cs="Arial"/>
+          <w:del w:id="104" w:author="Linh Dang" w:date="2026-06-03T14:00:24Z"/>
+        </w:rPr>
+      </w:pPr>
+      <w:del w:id="103" w:author="Linh Dang" w:date="2026-06-03T14:00:24Z">
         <w:r>
           <w:rPr>
             <w:rFonts w:cs="Arial" w:ascii="Arial" w:hAnsi="Arial"/>
@@ -1892,10 +2077,10 @@
         <w:jc w:val="both"/>
         <w:rPr>
           <w:rFonts w:ascii="Arial" w:hAnsi="Arial" w:cs="Arial"/>
-          <w:del w:id="75" w:author="Linh Dang" w:date="2026-06-03T14:00:24Z"/>
-        </w:rPr>
-      </w:pPr>
-      <w:del w:id="74" w:author="Linh Dang" w:date="2026-06-03T14:00:24Z">
+          <w:del w:id="106" w:author="Linh Dang" w:date="2026-06-03T14:00:24Z"/>
+        </w:rPr>
+      </w:pPr>
+      <w:del w:id="105" w:author="Linh Dang" w:date="2026-06-03T14:00:24Z">
         <w:r>
           <w:rPr>
             <w:rFonts w:cs="Arial" w:ascii="Arial" w:hAnsi="Arial"/>
@@ -1917,7 +2102,7 @@
           <w:rFonts w:ascii="Arial" w:hAnsi="Arial" w:cs="Arial"/>
         </w:rPr>
       </w:pPr>
-      <w:del w:id="76" w:author="Linh Dang" w:date="2026-06-03T14:00:24Z">
+      <w:del w:id="107" w:author="Linh Dang" w:date="2026-06-03T14:00:24Z">
         <w:bookmarkStart w:id="4" w:name="diversity-of-negative-controls_Copy_1_Co"/>
         <w:r>
           <w:rPr>
@@ -1953,7 +2138,7 @@
           <w:rFonts w:ascii="Arial" w:hAnsi="Arial" w:cs="Arial"/>
         </w:rPr>
       </w:pPr>
-      <w:del w:id="77" w:author="Linh Dang" w:date="2026-06-03T14:01:30Z">
+      <w:del w:id="108" w:author="Linh Dang" w:date="2026-06-03T14:01:30Z">
         <w:r>
           <w:rPr>
             <w:rFonts w:cs="Arial" w:ascii="Arial" w:hAnsi="Arial"/>
@@ -1961,7 +2146,7 @@
           <w:delText>In total, … different species were identified in all NCTs. To</w:delText>
         </w:r>
       </w:del>
-      <w:ins w:id="78" w:author="Linh Dang" w:date="2026-06-03T14:01:32Z">
+      <w:ins w:id="109" w:author="Linh Dang" w:date="2026-06-03T14:01:32Z">
         <w:r>
           <w:rPr>
             <w:rFonts w:cs="Arial" w:ascii="Arial" w:hAnsi="Arial"/>
@@ -2072,7 +2257,7 @@
         </w:rPr>
         <w:t xml:space="preserve">, were </w:t>
       </w:r>
-      <w:del w:id="79" w:author="Linh Dang" w:date="2026-06-03T15:46:39Z">
+      <w:del w:id="110" w:author="Linh Dang" w:date="2026-06-03T15:46:39Z">
         <w:r>
           <w:rPr>
             <w:rFonts w:cs="Arial" w:ascii="Arial" w:hAnsi="Arial"/>
@@ -2086,7 +2271,7 @@
         </w:rPr>
         <w:t xml:space="preserve"> high prevalent </w:t>
       </w:r>
-      <w:del w:id="80" w:author="Linh Dang" w:date="2026-06-03T15:46:45Z">
+      <w:del w:id="111" w:author="Linh Dang" w:date="2026-06-03T15:46:45Z">
         <w:r>
           <w:rPr>
             <w:rFonts w:cs="Arial" w:ascii="Arial" w:hAnsi="Arial"/>
@@ -2100,7 +2285,7 @@
         </w:rPr>
         <w:t xml:space="preserve"> </w:t>
       </w:r>
-      <w:del w:id="81" w:author="Linh Dang" w:date="2026-06-03T15:46:53Z">
+      <w:del w:id="112" w:author="Linh Dang" w:date="2026-06-03T15:46:53Z">
         <w:r>
           <w:rPr>
             <w:rFonts w:cs="Arial" w:ascii="Arial" w:hAnsi="Arial"/>
@@ -2108,7 +2293,7 @@
           <w:delText>high</w:delText>
         </w:r>
       </w:del>
-      <w:ins w:id="82" w:author="Linh Dang" w:date="2026-06-03T15:46:55Z">
+      <w:ins w:id="113" w:author="Linh Dang" w:date="2026-06-03T15:46:55Z">
         <w:r>
           <w:rPr>
             <w:rFonts w:cs="Arial" w:ascii="Arial" w:hAnsi="Arial"/>
@@ -2126,7 +2311,7 @@
         <w:rPr/>
         <w:commentReference w:id="18"/>
       </w:r>
-      <w:ins w:id="83" w:author="Linh Dang" w:date="2026-06-03T15:48:43Z">
+      <w:ins w:id="114" w:author="Linh Dang" w:date="2026-06-03T15:48:43Z">
         <w:r>
           <w:rPr/>
           <w:commentReference w:id="19"/>
@@ -2162,7 +2347,7 @@
         <w:rPr/>
         <w:commentReference w:id="21"/>
       </w:r>
-      <w:ins w:id="84" w:author="Linh Dang" w:date="2026-06-03T15:49:17Z">
+      <w:ins w:id="115" w:author="Linh Dang" w:date="2026-06-03T15:49:17Z">
         <w:r>
           <w:rPr/>
           <w:commentReference w:id="22"/>
@@ -2216,7 +2401,7 @@
           <w:rFonts w:ascii="Arial" w:hAnsi="Arial" w:cs="Arial"/>
         </w:rPr>
       </w:pPr>
-      <w:del w:id="85" w:author="Linh Dang" w:date="2026-06-16T13:20:04Z">
+      <w:del w:id="116" w:author="Linh Dang" w:date="2026-06-16T13:20:04Z">
         <w:r>
           <w:rPr>
             <w:rFonts w:cs="Arial" w:ascii="Arial" w:hAnsi="Arial"/>
@@ -2224,7 +2409,7 @@
           <w:delText xml:space="preserve">Following the correction for batch effects, differential abundance analysis (DAA) among control types revealed several taxa specifically enriched in paraffin controls (taxa </w:delText>
         </w:r>
       </w:del>
-      <w:del w:id="86" w:author="Linh Dang" w:date="2026-06-16T13:20:04Z">
+      <w:del w:id="117" w:author="Linh Dang" w:date="2026-06-16T13:20:04Z">
         <w:r>
           <w:rPr>
             <w:rFonts w:cs="Arial" w:ascii="Arial" w:hAnsi="Arial"/>
@@ -2234,7 +2419,7 @@
           <w:delText>XXX</w:delText>
         </w:r>
       </w:del>
-      <w:del w:id="87" w:author="Linh Dang" w:date="2026-06-16T13:20:04Z">
+      <w:del w:id="118" w:author="Linh Dang" w:date="2026-06-16T13:20:04Z">
         <w:r>
           <w:rPr>
             <w:rFonts w:cs="Arial" w:ascii="Arial" w:hAnsi="Arial"/>
@@ -2242,7 +2427,7 @@
           <w:delText xml:space="preserve"> from the analyses, Figure 1.</w:delText>
         </w:r>
       </w:del>
-      <w:del w:id="88" w:author="Linh Dang" w:date="2026-06-04T13:29:52Z">
+      <w:del w:id="119" w:author="Linh Dang" w:date="2026-06-04T13:29:52Z">
         <w:r>
           <w:rPr>
             <w:rFonts w:cs="Arial" w:ascii="Arial" w:hAnsi="Arial"/>
@@ -2250,7 +2435,7 @@
           <w:delText>6</w:delText>
         </w:r>
       </w:del>
-      <w:del w:id="89" w:author="Linh Dang" w:date="2026-06-16T13:20:04Z">
+      <w:del w:id="120" w:author="Linh Dang" w:date="2026-06-16T13:20:04Z">
         <w:r>
           <w:rPr>
             <w:rFonts w:cs="Arial" w:ascii="Arial" w:hAnsi="Arial"/>
@@ -2258,13 +2443,15 @@
           <w:delText>),</w:delText>
         </w:r>
       </w:del>
-      <w:del w:id="90" w:author="Linh Dang" w:date="2026-06-16T13:20:04Z">
-        <w:r>
-          <w:rPr/>
+      <w:del w:id="121" w:author="Linh Dang" w:date="2026-06-16T13:20:04Z">
+        <w:r>
+          <w:rPr>
+            <w:rFonts w:cs="Arial" w:ascii="Arial" w:hAnsi="Arial"/>
+          </w:rPr>
           <w:commentReference w:id="24"/>
         </w:r>
       </w:del>
-      <w:del w:id="91" w:author="Linh Dang" w:date="2026-06-16T13:20:04Z">
+      <w:del w:id="122" w:author="Linh Dang" w:date="2026-06-16T13:20:04Z">
         <w:r>
           <w:rPr>
             <w:rFonts w:cs="Arial" w:ascii="Arial" w:hAnsi="Arial"/>
@@ -2272,13 +2459,15 @@
           <w:delText xml:space="preserve"> </w:delText>
         </w:r>
       </w:del>
-      <w:del w:id="92" w:author="Linh Dang" w:date="2026-06-16T13:20:04Z">
-        <w:r>
-          <w:rPr/>
+      <w:del w:id="123" w:author="Linh Dang" w:date="2026-06-16T13:20:04Z">
+        <w:r>
+          <w:rPr>
+            <w:rFonts w:cs="Arial" w:ascii="Arial" w:hAnsi="Arial"/>
+          </w:rPr>
           <w:commentReference w:id="25"/>
         </w:r>
       </w:del>
-      <w:del w:id="93" w:author="Linh Dang" w:date="2026-06-16T13:20:04Z">
+      <w:del w:id="124" w:author="Linh Dang" w:date="2026-06-16T13:20:04Z">
         <w:r>
           <w:rPr>
             <w:rFonts w:cs="Arial" w:ascii="Arial" w:hAnsi="Arial"/>
@@ -2294,10 +2483,10 @@
         <w:jc w:val="both"/>
         <w:rPr>
           <w:rFonts w:ascii="Arial" w:hAnsi="Arial" w:cs="Arial"/>
-          <w:ins w:id="96" w:author="Linh Dang" w:date="2026-06-11T05:29:08Z"/>
-        </w:rPr>
-      </w:pPr>
-      <w:del w:id="94" w:author="Linh Dang" w:date="2026-06-11T05:29:00Z">
+          <w:ins w:id="127" w:author="Linh Dang" w:date="2026-06-11T05:29:08Z"/>
+        </w:rPr>
+      </w:pPr>
+      <w:del w:id="125" w:author="Linh Dang" w:date="2026-06-11T05:29:00Z">
         <w:r>
           <w:rPr>
             <w:rFonts w:cs="Arial" w:ascii="Arial" w:hAnsi="Arial"/>
@@ -2305,7 +2494,7 @@
           <w:delText>Need elaborations</w:delText>
         </w:r>
       </w:del>
-      <w:ins w:id="95" w:author="Linh Dang" w:date="2026-06-11T05:29:08Z">
+      <w:ins w:id="126" w:author="Linh Dang" w:date="2026-06-11T05:29:08Z">
         <w:r>
           <w:rPr>
             <w:rFonts w:cs="Arial" w:ascii="Arial" w:hAnsi="Arial"/>
@@ -2323,7 +2512,7 @@
           <w:rFonts w:ascii="Arial" w:hAnsi="Arial" w:cs="Arial"/>
         </w:rPr>
       </w:pPr>
-      <w:ins w:id="97" w:author="Linh Dang" w:date="2026-06-11T05:35:48Z">
+      <w:ins w:id="128" w:author="Linh Dang" w:date="2026-06-11T05:35:48Z">
         <w:r>
           <w:rPr>
             <w:rFonts w:cs="Arial" w:ascii="Arial" w:hAnsi="Arial"/>
@@ -2331,7 +2520,7 @@
           <w:t xml:space="preserve">We applied The MaAslin2 R package for differential abundant analyses with respect to negative control types, as shown in Figure 1.E. </w:t>
         </w:r>
       </w:ins>
-      <w:ins w:id="98" w:author="Linh Dang" w:date="2026-06-11T05:35:48Z">
+      <w:ins w:id="129" w:author="Linh Dang" w:date="2026-06-11T05:35:48Z">
         <w:r>
           <w:rPr>
             <w:rFonts w:eastAsia="Aptos" w:cs="Arial" w:ascii="Arial" w:hAnsi="Arial" w:eastAsiaTheme="minorHAnsi"/>
@@ -2344,7 +2533,7 @@
           <w:t>Notably</w:t>
         </w:r>
       </w:ins>
-      <w:ins w:id="99" w:author="Linh Dang" w:date="2026-06-11T05:35:48Z">
+      <w:ins w:id="130" w:author="Linh Dang" w:date="2026-06-11T05:35:48Z">
         <w:r>
           <w:rPr>
             <w:rFonts w:cs="Arial" w:ascii="Arial" w:hAnsi="Arial"/>
@@ -2352,7 +2541,7 @@
           <w:t>,</w:t>
         </w:r>
       </w:ins>
-      <w:ins w:id="100" w:author="Linh Dang" w:date="2026-06-11T05:44:47Z">
+      <w:ins w:id="131" w:author="Linh Dang" w:date="2026-06-11T05:44:47Z">
         <w:r>
           <w:rPr>
             <w:rFonts w:cs="Arial" w:ascii="Arial" w:hAnsi="Arial"/>
@@ -2360,7 +2549,7 @@
           <w:t xml:space="preserve"> </w:t>
         </w:r>
       </w:ins>
-      <w:ins w:id="101" w:author="Linh Dang" w:date="2026-06-11T05:48:17Z">
+      <w:ins w:id="132" w:author="Linh Dang" w:date="2026-06-11T05:48:17Z">
         <w:r>
           <w:rPr>
             <w:rFonts w:cs="Arial" w:ascii="Arial" w:hAnsi="Arial"/>
@@ -2368,7 +2557,7 @@
           <w:t xml:space="preserve">we </w:t>
         </w:r>
       </w:ins>
-      <w:ins w:id="102" w:author="Linh Dang" w:date="2026-06-11T05:50:10Z">
+      <w:ins w:id="133" w:author="Linh Dang" w:date="2026-06-11T05:50:10Z">
         <w:r>
           <w:rPr>
             <w:rFonts w:cs="Arial" w:ascii="Arial" w:hAnsi="Arial"/>
@@ -2376,7 +2565,7 @@
           <w:t xml:space="preserve">also add </w:t>
         </w:r>
       </w:ins>
-      <w:ins w:id="103" w:author="Linh Dang" w:date="2026-06-11T05:50:10Z">
+      <w:ins w:id="134" w:author="Linh Dang" w:date="2026-06-11T05:50:10Z">
         <w:r>
           <w:rPr>
             <w:rFonts w:eastAsia="Aptos" w:cs="Arial" w:ascii="Arial" w:hAnsi="Arial" w:eastAsiaTheme="minorHAnsi"/>
@@ -2389,7 +2578,7 @@
           <w:t>laboratory</w:t>
         </w:r>
       </w:ins>
-      <w:ins w:id="104" w:author="Linh Dang" w:date="2026-06-11T05:50:10Z">
+      <w:ins w:id="135" w:author="Linh Dang" w:date="2026-06-11T05:50:10Z">
         <w:r>
           <w:rPr>
             <w:rFonts w:cs="Arial" w:ascii="Arial" w:hAnsi="Arial"/>
@@ -2397,7 +2586,7 @@
           <w:t xml:space="preserve"> </w:t>
         </w:r>
       </w:ins>
-      <w:ins w:id="105" w:author="Linh Dang" w:date="2026-06-11T05:50:10Z">
+      <w:ins w:id="136" w:author="Linh Dang" w:date="2026-06-11T05:50:10Z">
         <w:r>
           <w:rPr>
             <w:rFonts w:eastAsia="Aptos" w:cs="Arial" w:ascii="Arial" w:hAnsi="Arial" w:eastAsiaTheme="minorHAnsi"/>
@@ -2410,7 +2599,7 @@
           <w:t>personnel</w:t>
         </w:r>
       </w:ins>
-      <w:ins w:id="106" w:author="Linh Dang" w:date="2026-06-11T05:50:10Z">
+      <w:ins w:id="137" w:author="Linh Dang" w:date="2026-06-11T05:50:10Z">
         <w:r>
           <w:rPr>
             <w:rFonts w:cs="Arial" w:ascii="Arial" w:hAnsi="Arial"/>
@@ -2418,7 +2607,7 @@
           <w:t xml:space="preserve"> as a covariate</w:t>
         </w:r>
       </w:ins>
-      <w:ins w:id="107" w:author="Linh Dang" w:date="2026-06-11T05:51:15Z">
+      <w:ins w:id="138" w:author="Linh Dang" w:date="2026-06-11T05:51:15Z">
         <w:r>
           <w:rPr>
             <w:rFonts w:cs="Arial" w:ascii="Arial" w:hAnsi="Arial"/>
@@ -2426,7 +2615,7 @@
           <w:t xml:space="preserve"> to the </w:t>
         </w:r>
       </w:ins>
-      <w:ins w:id="108" w:author="Linh Dang" w:date="2026-06-11T05:52:23Z">
+      <w:ins w:id="139" w:author="Linh Dang" w:date="2026-06-11T05:52:23Z">
         <w:r>
           <w:rPr>
             <w:rFonts w:cs="Arial" w:ascii="Arial" w:hAnsi="Arial"/>
@@ -2434,7 +2623,7 @@
           <w:t xml:space="preserve">model </w:t>
         </w:r>
       </w:ins>
-      <w:ins w:id="109" w:author="Linh Dang" w:date="2026-06-11T06:00:11Z">
+      <w:ins w:id="140" w:author="Linh Dang" w:date="2026-06-11T06:00:11Z">
         <w:r>
           <w:rPr>
             <w:rFonts w:cs="Arial" w:ascii="Arial" w:hAnsi="Arial"/>
@@ -2442,7 +2631,7 @@
           <w:t xml:space="preserve">to accounting for its batch effect. The analyses show </w:t>
         </w:r>
       </w:ins>
-      <w:ins w:id="110" w:author="Linh Dang" w:date="2026-06-11T06:04:35Z">
+      <w:ins w:id="141" w:author="Linh Dang" w:date="2026-06-11T06:04:35Z">
         <w:r>
           <w:rPr>
             <w:rFonts w:cs="Arial" w:ascii="Arial" w:hAnsi="Arial"/>
@@ -2450,7 +2639,7 @@
           <w:t>that the abundance of many sp</w:t>
         </w:r>
       </w:ins>
-      <w:ins w:id="111" w:author="Linh Dang" w:date="2026-06-11T06:05:36Z">
+      <w:ins w:id="142" w:author="Linh Dang" w:date="2026-06-11T06:05:36Z">
         <w:r>
           <w:rPr>
             <w:rFonts w:cs="Arial" w:ascii="Arial" w:hAnsi="Arial"/>
@@ -2458,7 +2647,7 @@
           <w:t xml:space="preserve">ecies from </w:t>
         </w:r>
       </w:ins>
-      <w:ins w:id="112" w:author="Linh Dang" w:date="2026-06-11T06:05:36Z">
+      <w:ins w:id="143" w:author="Linh Dang" w:date="2026-06-11T06:05:36Z">
         <w:r>
           <w:rPr>
             <w:rFonts w:cs="Arial" w:ascii="Arial" w:hAnsi="Arial"/>
@@ -2468,7 +2657,7 @@
           <w:t>Burkholderia</w:t>
         </w:r>
       </w:ins>
-      <w:ins w:id="113" w:author="Linh Dang" w:date="2026-06-11T06:05:36Z">
+      <w:ins w:id="144" w:author="Linh Dang" w:date="2026-06-11T06:05:36Z">
         <w:r>
           <w:rPr>
             <w:rFonts w:cs="Arial" w:ascii="Arial" w:hAnsi="Arial"/>
@@ -2476,7 +2665,7 @@
           <w:t xml:space="preserve"> are enriched in buffer control compared to</w:t>
         </w:r>
       </w:ins>
-      <w:ins w:id="114" w:author="Linh Dang" w:date="2026-06-11T06:06:37Z">
+      <w:ins w:id="145" w:author="Linh Dang" w:date="2026-06-11T06:06:37Z">
         <w:r>
           <w:rPr>
             <w:rFonts w:cs="Arial" w:ascii="Arial" w:hAnsi="Arial"/>
@@ -2484,7 +2673,7 @@
           <w:t xml:space="preserve"> PCR control, while</w:t>
         </w:r>
       </w:ins>
-      <w:ins w:id="115" w:author="Linh Dang" w:date="2026-06-11T06:08:35Z">
+      <w:ins w:id="146" w:author="Linh Dang" w:date="2026-06-11T06:08:35Z">
         <w:r>
           <w:rPr>
             <w:rFonts w:cs="Arial" w:ascii="Arial" w:hAnsi="Arial"/>
@@ -2492,7 +2681,7 @@
           <w:t xml:space="preserve"> in paraffin controls species from Sphingomonas</w:t>
         </w:r>
       </w:ins>
-      <w:ins w:id="116" w:author="Linh Dang" w:date="2026-06-11T06:09:42Z">
+      <w:ins w:id="147" w:author="Linh Dang" w:date="2026-06-11T06:09:42Z">
         <w:r>
           <w:rPr>
             <w:rFonts w:cs="Arial" w:ascii="Arial" w:hAnsi="Arial"/>
@@ -2710,7 +2899,7 @@
         </w:tc>
         <w:tc>
           <w:tcPr>
-            <w:cellIns w:id="117" w:author="Unknown Author" w:date="2026-05-29T09:59:51Z"/>
+            <w:cellIns w:id="148" w:author="Unknown Author" w:date="2026-05-29T09:59:51Z"/>
             <w:tcW w:w="1350" w:type="dxa"/>
             <w:tcBorders>
               <w:bottom w:val="single" w:sz="6" w:space="0" w:color="000000"/>
@@ -2728,7 +2917,7 @@
                 <w:rFonts w:ascii="Arial" w:hAnsi="Arial" w:eastAsia="Aptos" w:cs="Arial"/>
               </w:rPr>
             </w:pPr>
-            <w:ins w:id="118" w:author="Unknown Author" w:date="2026-05-29T09:59:51Z">
+            <w:ins w:id="149" w:author="Unknown Author" w:date="2026-05-29T09:59:51Z">
               <w:r>
                 <w:rPr>
                   <w:rFonts w:eastAsia="Aptos" w:cs="Arial" w:ascii="Arial" w:hAnsi="Arial"/>
@@ -2740,7 +2929,7 @@
                 <w:t>‍</w:t>
               </w:r>
             </w:ins>
-            <w:ins w:id="119" w:author="Unknown Author" w:date="2026-05-29T09:59:51Z">
+            <w:ins w:id="150" w:author="Unknown Author" w:date="2026-05-29T09:59:51Z">
               <w:r>
                 <w:rPr>
                   <w:rFonts w:eastAsia="Aptos" w:cs="Arial" w:ascii="Arial" w:hAnsi="Arial"/>
@@ -2811,7 +3000,7 @@
               </w:rPr>
               <w:t>2</w:t>
             </w:r>
-            <w:ins w:id="120" w:author="Unknown Author" w:date="2026-05-29T10:03:40Z">
+            <w:ins w:id="151" w:author="Unknown Author" w:date="2026-05-29T10:03:40Z">
               <w:r>
                 <w:rPr>
                   <w:rFonts w:eastAsia="Aptos" w:cs="Arial" w:ascii="Arial" w:hAnsi="Arial"/>
@@ -2823,7 +3012,7 @@
                 <w:t>6</w:t>
               </w:r>
             </w:ins>
-            <w:del w:id="121" w:author="Unknown Author" w:date="2026-05-29T10:03:40Z">
+            <w:del w:id="152" w:author="Unknown Author" w:date="2026-05-29T10:03:40Z">
               <w:r>
                 <w:rPr>
                   <w:rFonts w:eastAsia="Aptos" w:cs="Arial" w:ascii="Arial" w:hAnsi="Arial"/>
@@ -2863,7 +3052,7 @@
               </w:rPr>
               <w:t>6</w:t>
             </w:r>
-            <w:ins w:id="122" w:author="Unknown Author" w:date="2026-05-29T10:04:07Z">
+            <w:ins w:id="153" w:author="Unknown Author" w:date="2026-05-29T10:04:07Z">
               <w:r>
                 <w:rPr>
                   <w:rFonts w:eastAsia="Aptos" w:cs="Arial" w:ascii="Arial" w:hAnsi="Arial"/>
@@ -2875,7 +3064,7 @@
                 <w:t>7</w:t>
               </w:r>
             </w:ins>
-            <w:del w:id="123" w:author="Unknown Author" w:date="2026-05-29T10:04:06Z">
+            <w:del w:id="154" w:author="Unknown Author" w:date="2026-05-29T10:04:06Z">
               <w:r>
                 <w:rPr>
                   <w:rFonts w:eastAsia="Aptos" w:cs="Arial" w:ascii="Arial" w:hAnsi="Arial"/>
@@ -2905,7 +3094,7 @@
                 <w:rFonts w:ascii="Arial" w:hAnsi="Arial" w:eastAsia="Aptos" w:cs="Arial"/>
               </w:rPr>
             </w:pPr>
-            <w:ins w:id="124" w:author="Unknown Author" w:date="2026-05-29T10:04:30Z">
+            <w:ins w:id="155" w:author="Unknown Author" w:date="2026-05-29T10:04:30Z">
               <w:r>
                 <w:rPr>
                   <w:rFonts w:eastAsia="Aptos" w:cs="Arial" w:ascii="Arial" w:hAnsi="Arial"/>
@@ -2917,7 +3106,7 @@
                 <w:t>17</w:t>
               </w:r>
             </w:ins>
-            <w:del w:id="125" w:author="Unknown Author" w:date="2026-05-29T10:04:30Z">
+            <w:del w:id="156" w:author="Unknown Author" w:date="2026-05-29T10:04:30Z">
               <w:r>
                 <w:rPr>
                   <w:rFonts w:eastAsia="Aptos" w:cs="Arial" w:ascii="Arial" w:hAnsi="Arial"/>
@@ -2947,7 +3136,7 @@
                 <w:rFonts w:ascii="Arial" w:hAnsi="Arial" w:eastAsia="Aptos" w:cs="Arial"/>
               </w:rPr>
             </w:pPr>
-            <w:ins w:id="126" w:author="Unknown Author" w:date="2026-05-29T10:04:57Z">
+            <w:ins w:id="157" w:author="Unknown Author" w:date="2026-05-29T10:04:57Z">
               <w:r>
                 <w:rPr>
                   <w:rFonts w:eastAsia="Aptos" w:cs="Arial" w:ascii="Arial" w:hAnsi="Arial"/>
@@ -2959,7 +3148,7 @@
                 <w:t>38</w:t>
               </w:r>
             </w:ins>
-            <w:del w:id="127" w:author="Unknown Author" w:date="2026-05-29T10:04:56Z">
+            <w:del w:id="158" w:author="Unknown Author" w:date="2026-05-29T10:04:56Z">
               <w:r>
                 <w:rPr>
                   <w:rFonts w:eastAsia="Aptos" w:cs="Arial" w:ascii="Arial" w:hAnsi="Arial"/>
@@ -2975,7 +3164,7 @@
         </w:tc>
         <w:tc>
           <w:tcPr>
-            <w:cellIns w:id="128" w:author="Unknown Author" w:date="2026-05-29T09:59:51Z"/>
+            <w:cellIns w:id="159" w:author="Unknown Author" w:date="2026-05-29T09:59:51Z"/>
             <w:tcW w:w="1350" w:type="dxa"/>
             <w:tcBorders/>
           </w:tcPr>
@@ -2990,7 +3179,7 @@
                 <w:rFonts w:ascii="Arial" w:hAnsi="Arial" w:eastAsia="Aptos" w:cs="Arial"/>
               </w:rPr>
             </w:pPr>
-            <w:ins w:id="129" w:author="Unknown Author" w:date="2026-05-29T09:59:51Z">
+            <w:ins w:id="160" w:author="Unknown Author" w:date="2026-05-29T09:59:51Z">
               <w:r>
                 <w:rPr>
                   <w:rFonts w:eastAsia="Aptos" w:cs="Arial" w:ascii="Arial" w:hAnsi="Arial"/>
@@ -3002,7 +3191,7 @@
                 <w:t>‍</w:t>
               </w:r>
             </w:ins>
-            <w:ins w:id="130" w:author="Unknown Author" w:date="2026-05-29T10:03:06Z">
+            <w:ins w:id="161" w:author="Unknown Author" w:date="2026-05-29T10:03:06Z">
               <w:r>
                 <w:rPr>
                   <w:rFonts w:eastAsia="Aptos" w:cs="Arial" w:ascii="Arial" w:hAnsi="Arial"/>
@@ -3063,7 +3252,7 @@
                 <w:rFonts w:ascii="Arial" w:hAnsi="Arial" w:eastAsia="Aptos" w:cs="Arial"/>
               </w:rPr>
             </w:pPr>
-            <w:ins w:id="131" w:author="Unknown Author" w:date="2026-05-29T10:03:44Z">
+            <w:ins w:id="162" w:author="Unknown Author" w:date="2026-05-29T10:03:44Z">
               <w:r>
                 <w:rPr>
                   <w:rFonts w:eastAsia="Aptos" w:cs="Arial" w:ascii="Arial" w:hAnsi="Arial"/>
@@ -3075,7 +3264,7 @@
                 <w:t>2</w:t>
               </w:r>
             </w:ins>
-            <w:del w:id="132" w:author="Unknown Author" w:date="2026-05-29T10:03:44Z">
+            <w:del w:id="163" w:author="Unknown Author" w:date="2026-05-29T10:03:44Z">
               <w:r>
                 <w:rPr>
                   <w:rFonts w:eastAsia="Aptos" w:cs="Arial" w:ascii="Arial" w:hAnsi="Arial"/>
@@ -3115,7 +3304,7 @@
               </w:rPr>
               <w:t>5</w:t>
             </w:r>
-            <w:ins w:id="133" w:author="Unknown Author" w:date="2026-05-29T10:04:11Z">
+            <w:ins w:id="164" w:author="Unknown Author" w:date="2026-05-29T10:04:11Z">
               <w:r>
                 <w:rPr>
                   <w:rFonts w:eastAsia="Aptos" w:cs="Arial" w:ascii="Arial" w:hAnsi="Arial"/>
@@ -3127,7 +3316,7 @@
                 <w:t>6</w:t>
               </w:r>
             </w:ins>
-            <w:del w:id="134" w:author="Unknown Author" w:date="2026-05-29T10:04:11Z">
+            <w:del w:id="165" w:author="Unknown Author" w:date="2026-05-29T10:04:11Z">
               <w:r>
                 <w:rPr>
                   <w:rFonts w:eastAsia="Aptos" w:cs="Arial" w:ascii="Arial" w:hAnsi="Arial"/>
@@ -3157,7 +3346,7 @@
                 <w:rFonts w:ascii="Arial" w:hAnsi="Arial" w:eastAsia="Aptos" w:cs="Arial"/>
               </w:rPr>
             </w:pPr>
-            <w:ins w:id="135" w:author="Unknown Author" w:date="2026-05-29T10:04:35Z">
+            <w:ins w:id="166" w:author="Unknown Author" w:date="2026-05-29T10:04:35Z">
               <w:r>
                 <w:rPr>
                   <w:rFonts w:eastAsia="Aptos" w:cs="Arial" w:ascii="Arial" w:hAnsi="Arial"/>
@@ -3169,7 +3358,7 @@
                 <w:t>9</w:t>
               </w:r>
             </w:ins>
-            <w:del w:id="136" w:author="Unknown Author" w:date="2026-05-29T10:04:34Z">
+            <w:del w:id="167" w:author="Unknown Author" w:date="2026-05-29T10:04:34Z">
               <w:r>
                 <w:rPr>
                   <w:rFonts w:eastAsia="Aptos" w:cs="Arial" w:ascii="Arial" w:hAnsi="Arial"/>
@@ -3209,7 +3398,7 @@
               </w:rPr>
               <w:t>1</w:t>
             </w:r>
-            <w:del w:id="137" w:author="Unknown Author" w:date="2026-05-29T10:05:01Z">
+            <w:del w:id="168" w:author="Unknown Author" w:date="2026-05-29T10:05:01Z">
               <w:r>
                 <w:rPr>
                   <w:rFonts w:eastAsia="Aptos" w:cs="Arial" w:ascii="Arial" w:hAnsi="Arial"/>
@@ -3225,7 +3414,7 @@
         </w:tc>
         <w:tc>
           <w:tcPr>
-            <w:cellIns w:id="138" w:author="Unknown Author" w:date="2026-05-29T09:59:51Z"/>
+            <w:cellIns w:id="169" w:author="Unknown Author" w:date="2026-05-29T09:59:51Z"/>
             <w:tcW w:w="1350" w:type="dxa"/>
             <w:tcBorders/>
           </w:tcPr>
@@ -3240,7 +3429,7 @@
                 <w:rFonts w:ascii="Arial" w:hAnsi="Arial" w:eastAsia="Aptos" w:cs="Arial"/>
               </w:rPr>
             </w:pPr>
-            <w:ins w:id="139" w:author="Unknown Author" w:date="2026-05-29T09:59:51Z">
+            <w:ins w:id="170" w:author="Unknown Author" w:date="2026-05-29T09:59:51Z">
               <w:r>
                 <w:rPr>
                   <w:rFonts w:eastAsia="Aptos" w:cs="Arial" w:ascii="Arial" w:hAnsi="Arial"/>
@@ -3252,7 +3441,7 @@
                 <w:t>‍</w:t>
               </w:r>
             </w:ins>
-            <w:ins w:id="140" w:author="Unknown Author" w:date="2026-05-29T10:03:14Z">
+            <w:ins w:id="171" w:author="Unknown Author" w:date="2026-05-29T10:03:14Z">
               <w:r>
                 <w:rPr>
                   <w:rFonts w:eastAsia="Aptos" w:cs="Arial" w:ascii="Arial" w:hAnsi="Arial"/>
@@ -3341,7 +3530,7 @@
                 <w:rFonts w:ascii="Arial" w:hAnsi="Arial" w:eastAsia="Aptos" w:cs="Arial"/>
               </w:rPr>
             </w:pPr>
-            <w:ins w:id="141" w:author="Unknown Author" w:date="2026-05-29T10:04:16Z">
+            <w:ins w:id="172" w:author="Unknown Author" w:date="2026-05-29T10:04:16Z">
               <w:r>
                 <w:rPr>
                   <w:rFonts w:eastAsia="Aptos" w:cs="Arial" w:ascii="Arial" w:hAnsi="Arial"/>
@@ -3353,7 +3542,7 @@
                 <w:t>4</w:t>
               </w:r>
             </w:ins>
-            <w:del w:id="142" w:author="Unknown Author" w:date="2026-05-29T10:04:15Z">
+            <w:del w:id="173" w:author="Unknown Author" w:date="2026-05-29T10:04:15Z">
               <w:r>
                 <w:rPr>
                   <w:rFonts w:eastAsia="Aptos" w:cs="Arial" w:ascii="Arial" w:hAnsi="Arial"/>
@@ -3383,7 +3572,7 @@
                 <w:rFonts w:ascii="Arial" w:hAnsi="Arial" w:eastAsia="Aptos" w:cs="Arial"/>
               </w:rPr>
             </w:pPr>
-            <w:ins w:id="143" w:author="Unknown Author" w:date="2026-05-29T10:04:40Z">
+            <w:ins w:id="174" w:author="Unknown Author" w:date="2026-05-29T10:04:40Z">
               <w:r>
                 <w:rPr>
                   <w:rFonts w:eastAsia="Aptos" w:cs="Arial" w:ascii="Arial" w:hAnsi="Arial"/>
@@ -3395,7 +3584,7 @@
                 <w:t>4</w:t>
               </w:r>
             </w:ins>
-            <w:del w:id="144" w:author="Unknown Author" w:date="2026-05-29T10:04:40Z">
+            <w:del w:id="175" w:author="Unknown Author" w:date="2026-05-29T10:04:40Z">
               <w:r>
                 <w:rPr>
                   <w:rFonts w:eastAsia="Aptos" w:cs="Arial" w:ascii="Arial" w:hAnsi="Arial"/>
@@ -3425,7 +3614,7 @@
                 <w:rFonts w:ascii="Arial" w:hAnsi="Arial" w:eastAsia="Aptos" w:cs="Arial"/>
               </w:rPr>
             </w:pPr>
-            <w:ins w:id="145" w:author="Unknown Author" w:date="2026-05-29T10:05:05Z">
+            <w:ins w:id="176" w:author="Unknown Author" w:date="2026-05-29T10:05:05Z">
               <w:r>
                 <w:rPr>
                   <w:rFonts w:eastAsia="Aptos" w:cs="Arial" w:ascii="Arial" w:hAnsi="Arial"/>
@@ -3437,7 +3626,7 @@
                 <w:t>8</w:t>
               </w:r>
             </w:ins>
-            <w:del w:id="146" w:author="Unknown Author" w:date="2026-05-29T10:05:05Z">
+            <w:del w:id="177" w:author="Unknown Author" w:date="2026-05-29T10:05:05Z">
               <w:r>
                 <w:rPr>
                   <w:rFonts w:eastAsia="Aptos" w:cs="Arial" w:ascii="Arial" w:hAnsi="Arial"/>
@@ -3453,7 +3642,7 @@
         </w:tc>
         <w:tc>
           <w:tcPr>
-            <w:cellIns w:id="147" w:author="Unknown Author" w:date="2026-05-29T09:59:51Z"/>
+            <w:cellIns w:id="178" w:author="Unknown Author" w:date="2026-05-29T09:59:51Z"/>
             <w:tcW w:w="1350" w:type="dxa"/>
             <w:tcBorders/>
           </w:tcPr>
@@ -3468,7 +3657,7 @@
                 <w:rFonts w:ascii="Arial" w:hAnsi="Arial" w:eastAsia="Aptos" w:cs="Arial"/>
               </w:rPr>
             </w:pPr>
-            <w:ins w:id="148" w:author="Unknown Author" w:date="2026-05-29T09:59:51Z">
+            <w:ins w:id="179" w:author="Unknown Author" w:date="2026-05-29T09:59:51Z">
               <w:r>
                 <w:rPr>
                   <w:rFonts w:eastAsia="Aptos" w:cs="Arial" w:ascii="Arial" w:hAnsi="Arial"/>
@@ -3480,7 +3669,7 @@
                 <w:t>‍</w:t>
               </w:r>
             </w:ins>
-            <w:ins w:id="149" w:author="Unknown Author" w:date="2026-05-29T10:03:18Z">
+            <w:ins w:id="180" w:author="Unknown Author" w:date="2026-05-29T10:03:18Z">
               <w:r>
                 <w:rPr>
                   <w:rFonts w:eastAsia="Aptos" w:cs="Arial" w:ascii="Arial" w:hAnsi="Arial"/>
@@ -3602,7 +3791,7 @@
         </w:rPr>
         <w:t>prevalent and abundant oral microbiota in our NCT samples, we further explored the possible batch effect that is introduced by the LP that processed the samples. To this end, two LPs performed DNA extraction, library preparation and sequencing of four sterile water samples, which were equally distributed. The experiment was repeated twice in different environments. First</w:t>
       </w:r>
-      <w:ins w:id="150" w:author="Linh Dang" w:date="2026-06-04T16:26:21Z">
+      <w:ins w:id="181" w:author="Linh Dang" w:date="2026-06-04T16:26:21Z">
         <w:r>
           <w:rPr>
             <w:rFonts w:cs="Arial" w:ascii="Arial" w:hAnsi="Arial"/>
@@ -3644,7 +3833,7 @@
           <w:rFonts w:cs="Arial" w:ascii="Arial" w:hAnsi="Arial"/>
         </w:rPr>
       </w:r>
-      <w:ins w:id="151" w:author="Linh Dang" w:date="2026-06-11T09:33:44Z">
+      <w:ins w:id="182" w:author="Linh Dang" w:date="2026-06-11T09:33:44Z">
         <w:commentRangeEnd w:id="28"/>
         <w:r>
           <w:commentReference w:id="28"/>
@@ -3657,7 +3846,7 @@
       <w:r>
         <w:rPr/>
       </w:r>
-      <w:ins w:id="152" w:author="Linh Dang" w:date="2026-06-11T09:34:00Z">
+      <w:ins w:id="183" w:author="Linh Dang" w:date="2026-06-11T09:34:00Z">
         <w:commentRangeEnd w:id="27"/>
         <w:r>
           <w:commentReference w:id="27"/>
@@ -3673,7 +3862,7 @@
         </w:rPr>
         <w:t>; see Materials and Methods for full protocol). Notably, in univariate analyses alpha diversity analysis revealed no significant difference with respect to environmental condition (</w:t>
       </w:r>
-      <w:ins w:id="153" w:author="Linh Dang" w:date="2026-06-17T15:18:34Z">
+      <w:ins w:id="184" w:author="Linh Dang" w:date="2026-06-17T15:18:34Z">
         <w:r>
           <w:rPr>
             <w:rFonts w:cs="Arial" w:ascii="Arial" w:hAnsi="Arial"/>
@@ -3687,7 +3876,7 @@
         </w:rPr>
         <w:t xml:space="preserve">Observed species: </w:t>
       </w:r>
-      <w:del w:id="154" w:author="Linh Dang" w:date="2026-06-17T15:10:13Z">
+      <w:del w:id="185" w:author="Linh Dang" w:date="2026-06-17T15:10:13Z">
         <w:r>
           <w:rPr>
             <w:rFonts w:cs="Arial" w:ascii="Arial" w:hAnsi="Arial"/>
@@ -3701,7 +3890,7 @@
         </w:rPr>
         <w:t xml:space="preserve"> p = </w:t>
       </w:r>
-      <w:ins w:id="155" w:author="Linh Dang" w:date="2026-06-17T15:19:18Z">
+      <w:ins w:id="186" w:author="Linh Dang" w:date="2026-06-17T15:19:18Z">
         <w:r>
           <w:rPr>
             <w:rFonts w:cs="Arial" w:ascii="Arial" w:hAnsi="Arial"/>
@@ -3715,7 +3904,7 @@
         </w:rPr>
         <w:t>, Shannon</w:t>
       </w:r>
-      <w:ins w:id="156" w:author="Linh Dang" w:date="2026-06-17T15:19:26Z">
+      <w:ins w:id="187" w:author="Linh Dang" w:date="2026-06-17T15:19:26Z">
         <w:r>
           <w:rPr>
             <w:rFonts w:cs="Arial" w:ascii="Arial" w:hAnsi="Arial"/>
@@ -3729,7 +3918,7 @@
         </w:rPr>
         <w:t xml:space="preserve">: </w:t>
       </w:r>
-      <w:del w:id="157" w:author="Linh Dang" w:date="2026-06-17T15:10:18Z">
+      <w:del w:id="188" w:author="Linh Dang" w:date="2026-06-17T15:10:18Z">
         <w:commentRangeStart w:id="31"/>
         <w:r>
           <w:rPr>
@@ -3753,7 +3942,7 @@
         </w:rPr>
         <w:t xml:space="preserve"> p = </w:t>
       </w:r>
-      <w:ins w:id="158" w:author="Linh Dang" w:date="2026-06-17T15:19:41Z">
+      <w:ins w:id="189" w:author="Linh Dang" w:date="2026-06-17T15:19:41Z">
         <w:r>
           <w:rPr>
             <w:rFonts w:cs="Arial" w:ascii="Arial" w:hAnsi="Arial"/>
@@ -3767,7 +3956,7 @@
         </w:rPr>
         <w:t xml:space="preserve">), but  a clear distinction between LPs was observed (Observed species: </w:t>
       </w:r>
-      <w:del w:id="159" w:author="Linh Dang" w:date="2026-06-17T19:24:11Z">
+      <w:del w:id="190" w:author="Linh Dang" w:date="2026-06-17T19:24:11Z">
         <w:r>
           <w:rPr>
             <w:rFonts w:cs="Arial" w:ascii="Arial" w:hAnsi="Arial"/>
@@ -3781,7 +3970,7 @@
         </w:rPr>
         <w:t xml:space="preserve">, p = </w:t>
       </w:r>
-      <w:ins w:id="160" w:author="Linh Dang" w:date="2026-06-17T19:25:56Z">
+      <w:ins w:id="191" w:author="Linh Dang" w:date="2026-06-17T19:25:56Z">
         <w:r>
           <w:rPr>
             <w:rFonts w:cs="Arial" w:ascii="Arial" w:hAnsi="Arial"/>
@@ -3795,7 +3984,7 @@
         </w:rPr>
         <w:t xml:space="preserve">, Shannon: </w:t>
       </w:r>
-      <w:del w:id="161" w:author="Linh Dang" w:date="2026-06-17T19:24:20Z">
+      <w:del w:id="192" w:author="Linh Dang" w:date="2026-06-17T19:24:20Z">
         <w:r>
           <w:rPr>
             <w:rFonts w:cs="Arial" w:ascii="Arial" w:hAnsi="Arial"/>
@@ -3809,7 +3998,7 @@
         </w:rPr>
         <w:t xml:space="preserve">, p </w:t>
       </w:r>
-      <w:ins w:id="162" w:author="Linh Dang" w:date="2026-06-17T19:26:07Z">
+      <w:ins w:id="193" w:author="Linh Dang" w:date="2026-06-17T19:26:07Z">
         <w:r>
           <w:rPr>
             <w:rFonts w:cs="Arial" w:ascii="Arial" w:hAnsi="Arial"/>
@@ -3817,7 +4006,7 @@
           <w:t>&lt; 0.001</w:t>
         </w:r>
       </w:ins>
-      <w:del w:id="163" w:author="Linh Dang" w:date="2026-06-17T19:26:07Z">
+      <w:del w:id="194" w:author="Linh Dang" w:date="2026-06-17T19:26:07Z">
         <w:r>
           <w:rPr>
             <w:rFonts w:cs="Arial" w:ascii="Arial" w:hAnsi="Arial"/>
@@ -3831,7 +4020,7 @@
         </w:rPr>
         <w:t xml:space="preserve"> ,Figure 2.</w:t>
       </w:r>
-      <w:ins w:id="164" w:author="Linh Dang" w:date="2026-06-17T19:25:48Z">
+      <w:ins w:id="195" w:author="Linh Dang" w:date="2026-06-17T19:25:48Z">
         <w:r>
           <w:rPr>
             <w:rFonts w:cs="Arial" w:ascii="Arial" w:hAnsi="Arial"/>
@@ -3839,7 +4028,7 @@
           <w:t>B</w:t>
         </w:r>
       </w:ins>
-      <w:del w:id="165" w:author="Linh Dang" w:date="2026-06-17T19:25:46Z">
+      <w:del w:id="196" w:author="Linh Dang" w:date="2026-06-17T19:25:46Z">
         <w:r>
           <w:rPr>
             <w:rFonts w:cs="Arial" w:ascii="Arial" w:hAnsi="Arial"/>
@@ -3877,7 +4066,7 @@
       <w:r>
         <w:rPr/>
       </w:r>
-      <w:ins w:id="166" w:author="Linh Dang" w:date="2026-06-11T09:50:53Z">
+      <w:ins w:id="197" w:author="Linh Dang" w:date="2026-06-11T09:50:53Z">
         <w:commentRangeEnd w:id="32"/>
         <w:r>
           <w:commentReference w:id="32"/>
@@ -3893,7 +4082,7 @@
         </w:rPr>
         <w:t>), with no significant effect of environmental conditions (p-value = 0.3926; Fig. 2.</w:t>
       </w:r>
-      <w:ins w:id="167" w:author="Linh Dang" w:date="2026-06-17T19:28:38Z">
+      <w:ins w:id="198" w:author="Linh Dang" w:date="2026-06-17T19:28:38Z">
         <w:r>
           <w:rPr>
             <w:rFonts w:cs="Arial" w:ascii="Arial" w:hAnsi="Arial"/>
@@ -3901,7 +4090,7 @@
           <w:t>C</w:t>
         </w:r>
       </w:ins>
-      <w:del w:id="168" w:author="Linh Dang" w:date="2026-06-17T19:28:32Z">
+      <w:del w:id="199" w:author="Linh Dang" w:date="2026-06-17T19:28:32Z">
         <w:r>
           <w:rPr>
             <w:rFonts w:cs="Arial" w:ascii="Arial" w:hAnsi="Arial"/>
@@ -3909,9 +4098,11 @@
           <w:delText>3</w:delText>
         </w:r>
       </w:del>
-      <w:del w:id="169" w:author="Linh Dang" w:date="2026-06-17T19:28:32Z">
-        <w:r>
-          <w:rPr/>
+      <w:del w:id="200" w:author="Linh Dang" w:date="2026-06-17T19:28:32Z">
+        <w:r>
+          <w:rPr>
+            <w:rFonts w:cs="Arial" w:ascii="Arial" w:hAnsi="Arial"/>
+          </w:rPr>
           <w:commentReference w:id="34"/>
         </w:r>
       </w:del>
@@ -3921,7 +4112,7 @@
         </w:rPr>
         <w:t xml:space="preserve">). Notably, </w:t>
       </w:r>
-      <w:ins w:id="170" w:author="Linh Dang" w:date="2026-06-17T19:44:30Z">
+      <w:ins w:id="201" w:author="Linh Dang" w:date="2026-06-17T19:44:30Z">
         <w:r>
           <w:rPr>
             <w:rFonts w:cs="Arial" w:ascii="Arial" w:hAnsi="Arial"/>
@@ -3935,7 +4126,7 @@
         </w:rPr>
         <w:t xml:space="preserve">after adjusting LP as random effect in a </w:t>
       </w:r>
-      <w:del w:id="171" w:author="Linh Dang" w:date="2026-06-17T19:49:23Z">
+      <w:del w:id="202" w:author="Linh Dang" w:date="2026-06-17T19:49:23Z">
         <w:commentRangeStart w:id="35"/>
         <w:r>
           <w:rPr>
@@ -3944,7 +4135,7 @@
           <w:delText>multiple</w:delText>
         </w:r>
       </w:del>
-      <w:ins w:id="172" w:author="Linh Dang" w:date="2026-06-17T19:49:27Z">
+      <w:ins w:id="203" w:author="Linh Dang" w:date="2026-06-17T19:49:27Z">
         <w:r>
           <w:rPr>
             <w:rFonts w:cs="Arial" w:ascii="Arial" w:hAnsi="Arial"/>
@@ -4189,7 +4380,7 @@
         </w:rPr>
         <w:t xml:space="preserve">3. </w:t>
       </w:r>
-      <w:del w:id="173" w:author="Linh Dang" w:date="2026-07-06T12:37:23Z">
+      <w:del w:id="204" w:author="Linh Dang" w:date="2026-07-06T12:37:23Z">
         <w:r>
           <w:rPr>
             <w:rFonts w:cs="Arial" w:ascii="Arial" w:hAnsi="Arial"/>
@@ -4203,7 +4394,7 @@
         </w:rPr>
         <w:t>Decontamination Methods</w:t>
       </w:r>
-      <w:ins w:id="174" w:author="Linh Dang" w:date="2026-07-06T12:37:31Z">
+      <w:ins w:id="205" w:author="Linh Dang" w:date="2026-07-06T12:37:31Z">
         <w:r>
           <w:rPr>
             <w:rFonts w:cs="Arial" w:ascii="Arial" w:hAnsi="Arial"/>
@@ -4211,7 +4402,7 @@
           <w:t xml:space="preserve"> with multi-step filtering procedure performs the best</w:t>
         </w:r>
       </w:ins>
-      <w:ins w:id="175" w:author="Linh Dang" w:date="2026-07-06T12:31:19Z">
+      <w:ins w:id="206" w:author="Linh Dang" w:date="2026-07-06T12:31:19Z">
         <w:r>
           <w:rPr>
             <w:rFonts w:cs="Arial" w:ascii="Arial" w:hAnsi="Arial"/>
@@ -4289,7 +4480,7 @@
           <w:rFonts w:ascii="Arial" w:hAnsi="Arial" w:cs="Arial"/>
         </w:rPr>
       </w:pPr>
-      <w:del w:id="176" w:author="Linh Dang" w:date="2026-07-06T11:06:38Z">
+      <w:del w:id="207" w:author="Linh Dang" w:date="2026-07-06T11:06:38Z">
         <w:r>
           <w:rPr>
             <w:rFonts w:cs="Arial" w:ascii="Arial" w:hAnsi="Arial"/>
@@ -4297,7 +4488,7 @@
           <w:delText>Firstly</w:delText>
         </w:r>
       </w:del>
-      <w:ins w:id="177" w:author="Linh Dang" w:date="2026-07-06T11:06:42Z">
+      <w:ins w:id="208" w:author="Linh Dang" w:date="2026-07-06T11:06:42Z">
         <w:r>
           <w:rPr>
             <w:rFonts w:cs="Arial" w:ascii="Arial" w:hAnsi="Arial"/>
@@ -4311,7 +4502,7 @@
         </w:rPr>
         <w:t xml:space="preserve">, a comparison was made between decontamination data sets </w:t>
       </w:r>
-      <w:del w:id="178" w:author="Linh Dang" w:date="2026-07-06T11:05:43Z">
+      <w:del w:id="209" w:author="Linh Dang" w:date="2026-07-06T11:05:43Z">
         <w:r>
           <w:rPr>
             <w:rFonts w:cs="Arial" w:ascii="Arial" w:hAnsi="Arial"/>
@@ -4319,7 +4510,7 @@
           <w:delText>and the</w:delText>
         </w:r>
       </w:del>
-      <w:ins w:id="179" w:author="Linh Dang" w:date="2026-07-06T11:05:45Z">
+      <w:ins w:id="210" w:author="Linh Dang" w:date="2026-07-06T11:05:45Z">
         <w:r>
           <w:rPr>
             <w:rFonts w:cs="Arial" w:ascii="Arial" w:hAnsi="Arial"/>
@@ -4333,7 +4524,7 @@
         </w:rPr>
         <w:t xml:space="preserve"> longitudinally </w:t>
       </w:r>
-      <w:del w:id="180" w:author="Linh Dang" w:date="2026-07-06T11:06:09Z">
+      <w:del w:id="211" w:author="Linh Dang" w:date="2026-07-06T11:06:09Z">
         <w:r>
           <w:rPr>
             <w:rFonts w:cs="Arial" w:ascii="Arial" w:hAnsi="Arial"/>
@@ -4347,7 +4538,7 @@
         </w:rPr>
         <w:t xml:space="preserve"> contaminant profile. </w:t>
       </w:r>
-      <w:del w:id="181" w:author="Linh Dang" w:date="2026-07-06T11:07:25Z">
+      <w:del w:id="212" w:author="Linh Dang" w:date="2026-07-06T11:07:25Z">
         <w:r>
           <w:rPr>
             <w:rFonts w:cs="Arial" w:ascii="Arial" w:hAnsi="Arial"/>
@@ -4355,7 +4546,7 @@
           <w:delText>Secondly</w:delText>
         </w:r>
       </w:del>
-      <w:ins w:id="182" w:author="Linh Dang" w:date="2026-07-06T11:07:29Z">
+      <w:ins w:id="213" w:author="Linh Dang" w:date="2026-07-06T11:07:29Z">
         <w:r>
           <w:rPr>
             <w:rFonts w:eastAsia="Aptos" w:cs="Arial" w:ascii="Arial" w:hAnsi="Arial" w:eastAsiaTheme="minorHAnsi"/>
@@ -4384,7 +4575,7 @@
           <w:rFonts w:ascii="Arial" w:hAnsi="Arial" w:cs="Arial"/>
         </w:rPr>
       </w:pPr>
-      <w:del w:id="183" w:author="Linh Dang" w:date="2026-07-06T12:42:20Z">
+      <w:del w:id="214" w:author="Linh Dang" w:date="2026-07-06T12:42:20Z">
         <w:r>
           <w:rPr>
             <w:rFonts w:cs="Arial" w:ascii="Arial" w:hAnsi="Arial"/>
@@ -4416,7 +4607,7 @@
         <w:rPr/>
         <w:commentReference w:id="44"/>
       </w:r>
-      <w:ins w:id="184" w:author="Linh Dang" w:date="2026-07-06T10:51:12Z">
+      <w:ins w:id="215" w:author="Linh Dang" w:date="2026-07-06T10:51:12Z">
         <w:r>
           <w:rPr/>
           <w:commentReference w:id="45"/>
@@ -4428,7 +4619,7 @@
         </w:rPr>
         <w:t xml:space="preserve">We leveraged the longitudinally derived contaminant profile from above mentioned experiments as a negative reference for evaluation and defined a composite score comprising two complementary components: yield and purity. First, yield is the proportion of putative significant taxa absent from the NCT survey over the number of observed species. On the other hand, purity is the proportion of NCT-absent taxa among all putative significant taxa over the total number of putative significant taxa. The composite score, which is the product of yield and purity, simultaneously rewards methods that exclude contaminant taxa while prevents excessive removal of true taxa (see Materials and Methods section for more details). Scores were computed per sample, and methods were compared using a </w:t>
       </w:r>
-      <w:ins w:id="185" w:author="Linh Dang" w:date="2026-07-06T12:21:19Z">
+      <w:ins w:id="216" w:author="Linh Dang" w:date="2026-07-06T12:21:19Z">
         <w:commentRangeStart w:id="46"/>
         <w:r>
           <w:rPr>
@@ -4442,7 +4633,7 @@
           <w:rFonts w:cs="Arial" w:ascii="Arial" w:hAnsi="Arial"/>
         </w:rPr>
       </w:r>
-      <w:del w:id="186" w:author="Linh Dang" w:date="2026-07-06T12:21:01Z">
+      <w:del w:id="217" w:author="Linh Dang" w:date="2026-07-06T12:21:01Z">
         <w:commentRangeEnd w:id="46"/>
         <w:r>
           <w:commentReference w:id="46"/>
@@ -4482,7 +4673,7 @@
         </w:rPr>
         <w:t>ND data scored lower than Nj and restrictive method, on the same level with Decontam method. Interestingly, the composite score from SCRuB is the smallest. Normally</w:t>
       </w:r>
-      <w:ins w:id="187" w:author="Linh Dang" w:date="2026-07-06T12:27:06Z">
+      <w:ins w:id="218" w:author="Linh Dang" w:date="2026-07-06T12:27:06Z">
         <w:r>
           <w:rPr>
             <w:rFonts w:cs="Arial" w:ascii="Arial" w:hAnsi="Arial"/>
@@ -4668,10 +4859,10 @@
           </w:pPr>
         </w:pPrChange>
         <w:rPr>
-          <w:ins w:id="189" w:author="Linh Dang" w:date="2026-07-06T14:29:09Z"/>
-        </w:rPr>
-      </w:pPr>
-      <w:ins w:id="188" w:author="Linh Dang" w:date="2026-07-06T14:29:09Z">
+          <w:ins w:id="220" w:author="Linh Dang" w:date="2026-07-06T14:29:09Z"/>
+        </w:rPr>
+      </w:pPr>
+      <w:ins w:id="219" w:author="Linh Dang" w:date="2026-07-06T14:29:09Z">
         <w:r>
           <w:rPr/>
           <w:t>3.3 Test of Ratio</w:t>
@@ -4904,7 +5095,7 @@
                 <w:rFonts w:ascii="Arial" w:hAnsi="Arial" w:eastAsia="Aptos" w:cs="Arial"/>
               </w:rPr>
             </w:pPr>
-            <w:ins w:id="190" w:author="Linh Dang" w:date="2026-07-06T14:30:58Z">
+            <w:ins w:id="221" w:author="Linh Dang" w:date="2026-07-06T14:30:58Z">
               <w:r>
                 <w:rPr>
                   <w:rFonts w:eastAsia="Aptos" w:cs="Arial" w:ascii="Arial" w:hAnsi="Arial"/>
@@ -4916,7 +5107,7 @@
                 <w:t>Count of union</w:t>
               </w:r>
             </w:ins>
-            <w:del w:id="191" w:author="Linh Dang" w:date="2026-07-06T14:30:54Z">
+            <w:del w:id="222" w:author="Linh Dang" w:date="2026-07-06T14:30:54Z">
               <w:r>
                 <w:rPr>
                   <w:rFonts w:eastAsia="Aptos" w:cs="Arial" w:ascii="Arial" w:hAnsi="Arial"/>
@@ -4928,9 +5119,15 @@
                 <w:delText>n_union</w:delText>
               </w:r>
             </w:del>
-            <w:del w:id="192" w:author="Linh Dang" w:date="2026-07-06T14:30:54Z">
+            <w:del w:id="223" w:author="Linh Dang" w:date="2026-07-06T14:30:54Z">
               <w:r>
-                <w:rPr/>
+                <w:rPr>
+                  <w:rFonts w:eastAsia="Aptos" w:cs="Arial" w:ascii="Arial" w:hAnsi="Arial"/>
+                  <w:kern w:val="0"/>
+                  <w:sz w:val="24"/>
+                  <w:szCs w:val="24"/>
+                  <w:lang w:val="en-US" w:eastAsia="en-US" w:bidi="ar-SA"/>
+                </w:rPr>
                 <w:commentReference w:id="53"/>
               </w:r>
             </w:del>
@@ -5821,8 +6018,8 @@
               </w:rPr>
               <w:t>0.641</w:t>
             </w:r>
-            <w:bookmarkStart w:id="9" w:name="benchmarking-of-decontamination-methods"/>
-            <w:bookmarkStart w:id="10" w:name="assessment-using-technical-replicates"/>
+            <w:bookmarkStart w:id="9" w:name="assessment-using-technical-replicates"/>
+            <w:bookmarkStart w:id="10" w:name="benchmarking-of-decontamination-methods"/>
             <w:bookmarkEnd w:id="9"/>
             <w:bookmarkEnd w:id="10"/>
           </w:p>
@@ -6133,14 +6330,14 @@
         <w:rPr>
           <w:rFonts w:cs="Arial" w:ascii="Arial" w:hAnsi="Arial"/>
         </w:rPr>
-        <w:t>genome of 13550 bacterial taxa, latest updated on Dece</w:t>
+        <w:t>genome of 13550 bacterial taxa, latest updated on Dec</w:t>
       </w:r>
       <w:bookmarkEnd w:id="12"/>
       <w:r>
         <w:rPr>
           <w:rFonts w:cs="Arial" w:ascii="Arial" w:hAnsi="Arial"/>
         </w:rPr>
-        <w:t>mber 2024.</w:t>
+        <w:t>ember 2024.</w:t>
       </w:r>
     </w:p>
     <w:p>
@@ -6440,14 +6637,14 @@
         <w:rPr>
           <w:rFonts w:cs="Arial" w:ascii="Arial" w:hAnsi="Arial"/>
         </w:rPr>
-        <w:t xml:space="preserve"> and Wrench method in R package (8) for norm</w:t>
+        <w:t xml:space="preserve"> and Wrench method in R package (8) for nor</w:t>
       </w:r>
       <w:bookmarkEnd w:id="14"/>
       <w:r>
         <w:rPr>
           <w:rFonts w:cs="Arial" w:ascii="Arial" w:hAnsi="Arial"/>
         </w:rPr>
-        <w:t>alization.</w:t>
+        <w:t>malization.</w:t>
       </w:r>
     </w:p>
     <w:p>
@@ -7459,260 +7656,276 @@
   <w:comment w:id="0" w:author="Christoph Ammer-Herrmenau" w:date="2026-04-13T22:16:00Z" w:initials="CA">
     <w:p>
       <w:pPr>
+        <w:overflowPunct w:val="false"/>
+        <w:spacing w:before="0" w:after="0"/>
+        <w:rPr/>
+      </w:pPr>
+      <w:hyperlink r:id="rId1">
+        <w:r>
+          <w:rPr>
+            <w:rFonts w:ascii="Liberation Serif" w:hAnsi="Liberation Serif" w:eastAsia="DejaVu Sans" w:cs="Noto Sans Arabic UI"/>
+            <w:lang w:val="en-US" w:eastAsia="en-US" w:bidi="en-US"/>
+          </w:rPr>
+          <w:t xml:space="preserve">https://doi.org/10.1158/2159-8290.CD-21-1059 </w:t>
+        </w:r>
+      </w:hyperlink>
+    </w:p>
+  </w:comment>
+  <w:comment w:id="1" w:author="Christoph Ammer-Herrmenau" w:date="2026-04-13T22:16:00Z" w:initials="CA">
+    <w:p>
+      <w:pPr>
+        <w:overflowPunct w:val="false"/>
+        <w:spacing w:before="0" w:after="0"/>
+        <w:rPr/>
+      </w:pPr>
+      <w:r>
+        <w:rPr>
+          <w:rFonts w:ascii="Liberation Serif" w:hAnsi="Liberation Serif" w:eastAsia="DejaVu Sans" w:cs="Noto Sans Arabic UI"/>
+          <w:lang w:val="en-US" w:eastAsia="en-US" w:bidi="en-US"/>
+        </w:rPr>
+        <w:t>Requilme et al, Pushalkar et al Nejman et al, Geller et al.</w:t>
+      </w:r>
+    </w:p>
+  </w:comment>
+  <w:comment w:id="2" w:author="Christoph Ammer-Herrmenau" w:date="2026-04-13T22:19:00Z" w:initials="CA">
+    <w:p>
+      <w:pPr>
+        <w:overflowPunct w:val="false"/>
+        <w:spacing w:before="0" w:after="0"/>
+        <w:rPr/>
+      </w:pPr>
+      <w:r>
+        <w:rPr>
+          <w:rFonts w:ascii="Liberation Serif" w:hAnsi="Liberation Serif" w:eastAsia="DejaVu Sans" w:cs="Noto Sans Arabic UI"/>
+          <w:lang w:val="en-US" w:eastAsia="en-US" w:bidi="en-US"/>
+        </w:rPr>
+        <w:t>Cell paper intratumoral microbiome.</w:t>
+      </w:r>
+    </w:p>
+  </w:comment>
+  <w:comment w:id="3" w:author="Christoph Ammer-Herrmenau" w:date="2026-04-22T21:34:00Z" w:initials="CA">
+    <w:p>
+      <w:pPr>
+        <w:overflowPunct w:val="false"/>
+        <w:spacing w:before="0" w:after="0"/>
+        <w:rPr/>
+      </w:pPr>
+      <w:r>
+        <w:rPr>
+          <w:rFonts w:ascii="Liberation Serif" w:hAnsi="Liberation Serif" w:eastAsia="DejaVu Sans" w:cs="Noto Sans Arabic UI"/>
+          <w:lang w:val="en-US" w:eastAsia="en-US" w:bidi="en-US"/>
+        </w:rPr>
+        <w:t>Better figure 1A, B etc.</w:t>
+      </w:r>
+    </w:p>
+  </w:comment>
+  <w:comment w:id="4" w:author="Christoph Ammer-Herrmenau" w:date="2026-04-22T21:34:00Z" w:initials="CA">
+    <w:p>
+      <w:pPr>
+        <w:overflowPunct w:val="false"/>
+        <w:spacing w:before="0" w:after="0"/>
+        <w:rPr/>
+      </w:pPr>
+      <w:r>
+        <w:rPr>
+          <w:rFonts w:ascii="Liberation Serif" w:hAnsi="Liberation Serif" w:eastAsia="DejaVu Sans" w:cs="Noto Sans Arabic UI"/>
+          <w:lang w:val="en-US" w:eastAsia="en-US" w:bidi="en-US"/>
+        </w:rPr>
+        <w:t>Here I identified more than 10 H2O controls in PDA-MAPS and P-MAPS has even more.</w:t>
+      </w:r>
+    </w:p>
+  </w:comment>
+  <w:comment w:id="6" w:author="Christoph Ammer-Herrmenau" w:date="2026-04-22T21:54:00Z" w:initials="CA">
+    <w:p>
+      <w:pPr>
+        <w:overflowPunct w:val="false"/>
+        <w:spacing w:before="0" w:after="0"/>
+        <w:rPr/>
+      </w:pPr>
+      <w:r>
+        <w:rPr>
+          <w:rFonts w:ascii="Liberation Serif" w:hAnsi="Liberation Serif" w:eastAsia="DejaVu Sans" w:cs="Noto Sans Arabic UI"/>
+          <w:lang w:val="en-US" w:eastAsia="en-US" w:bidi="en-US"/>
+        </w:rPr>
+        <w:t>I guess we should reevaluate the sample size too make the data more robust.</w:t>
+      </w:r>
+    </w:p>
+  </w:comment>
+  <w:comment w:id="5" w:author="Christoph Ammer-Herrmenau" w:date="2026-04-22T21:55:00Z" w:initials="CA">
+    <w:p>
+      <w:pPr>
+        <w:overflowPunct w:val="false"/>
+        <w:spacing w:before="0" w:after="0"/>
+        <w:rPr/>
+      </w:pPr>
+      <w:r>
+        <w:rPr>
+          <w:rFonts w:ascii="Liberation Serif" w:hAnsi="Liberation Serif" w:eastAsia="DejaVu Sans" w:cs="Noto Sans Arabic UI"/>
+          <w:lang w:val="en-US" w:eastAsia="en-US" w:bidi="en-US"/>
+        </w:rPr>
+        <w:t>Buffer and paraffin can remain like they are.</w:t>
+      </w:r>
+    </w:p>
+  </w:comment>
+  <w:comment w:id="7" w:author="Christoph Ammer-Herrmenau" w:date="2026-04-22T21:37:00Z" w:initials="CA">
+    <w:p>
+      <w:pPr>
+        <w:overflowPunct w:val="false"/>
+        <w:spacing w:before="0" w:after="0"/>
+        <w:rPr/>
+      </w:pPr>
+      <w:r>
+        <w:rPr>
+          <w:rFonts w:ascii="Liberation Serif" w:hAnsi="Liberation Serif" w:eastAsia="DejaVu Sans" w:cs="Noto Sans Arabic UI"/>
+          <w:lang w:val="en-US" w:eastAsia="en-US" w:bidi="en-US"/>
+        </w:rPr>
+        <w:t>I would define filter here as well.</w:t>
+      </w:r>
+    </w:p>
+  </w:comment>
+  <w:comment w:id="8" w:author="Christoph Ammer-Herrmenau" w:date="2026-04-22T21:40:00Z" w:initials="CA">
+    <w:p>
+      <w:pPr>
+        <w:overflowPunct w:val="false"/>
+        <w:spacing w:before="0" w:after="0"/>
+        <w:rPr/>
+      </w:pPr>
+      <w:r>
+        <w:rPr>
+          <w:rFonts w:ascii="Liberation Serif" w:hAnsi="Liberation Serif" w:eastAsia="DejaVu Sans" w:cs="Noto Sans Arabic UI"/>
+          <w:lang w:val="en-US" w:eastAsia="en-US" w:bidi="en-US"/>
+        </w:rPr>
+        <w:t>Figure 1B</w:t>
+      </w:r>
+    </w:p>
+  </w:comment>
+  <w:comment w:id="9" w:author="Christoph Ammer-Herrmenau" w:date="2026-04-23T21:35:00Z" w:initials="CA">
+    <w:p>
+      <w:pPr>
+        <w:overflowPunct w:val="false"/>
+        <w:spacing w:before="0" w:after="0"/>
+        <w:rPr/>
+      </w:pPr>
+      <w:r>
+        <w:rPr>
+          <w:rFonts w:ascii="Liberation Serif" w:hAnsi="Liberation Serif" w:eastAsia="DejaVu Sans" w:cs="Noto Sans Arabic UI"/>
+          <w:lang w:val="en-US" w:eastAsia="en-US" w:bidi="en-US"/>
+        </w:rPr>
+        <w:t>Do we have the alpha div for rarefaction or wrench normalization.</w:t>
+      </w:r>
+    </w:p>
+  </w:comment>
+  <w:comment w:id="10" w:author="Christoph Ammer-Herrmenau" w:date="2026-04-22T21:56:00Z" w:initials="CA">
+    <w:p>
+      <w:pPr>
+        <w:overflowPunct w:val="false"/>
+        <w:spacing w:before="0" w:after="0"/>
+        <w:rPr/>
+      </w:pPr>
+      <w:r>
+        <w:rPr>
+          <w:rFonts w:ascii="Liberation Serif" w:hAnsi="Liberation Serif" w:eastAsia="DejaVu Sans" w:cs="Noto Sans Arabic UI"/>
+          <w:lang w:val="en-US" w:eastAsia="en-US" w:bidi="en-US"/>
+        </w:rPr>
+        <w:t>Alpha- beta diversity?</w:t>
+      </w:r>
+    </w:p>
+  </w:comment>
+  <w:comment w:id="11" w:author="Christoph Ammer-Herrmenau" w:date="2026-04-22T21:57:00Z" w:initials="CA">
+    <w:p>
+      <w:pPr>
+        <w:overflowPunct w:val="false"/>
+        <w:spacing w:before="0" w:after="0"/>
+        <w:rPr/>
+      </w:pPr>
+      <w:r>
+        <w:rPr>
+          <w:rFonts w:ascii="Liberation Serif" w:hAnsi="Liberation Serif" w:eastAsia="DejaVu Sans" w:cs="Noto Sans Arabic UI"/>
+          <w:lang w:val="en-US" w:eastAsia="en-US" w:bidi="en-US"/>
+        </w:rPr>
+        <w:t>I would prefer to take only shannon OR Inv Simpson</w:t>
+      </w:r>
+    </w:p>
+  </w:comment>
+  <w:comment w:id="12" w:author="Christoph Ammer-Herrmenau" w:date="2026-04-22T21:58:00Z" w:initials="CA">
+    <w:p>
+      <w:pPr>
+        <w:overflowPunct w:val="false"/>
+        <w:spacing w:before="0" w:after="0"/>
+        <w:rPr/>
+      </w:pPr>
+      <w:r>
+        <w:rPr>
+          <w:rFonts w:ascii="Liberation Serif" w:hAnsi="Liberation Serif" w:eastAsia="DejaVu Sans" w:cs="Noto Sans Arabic UI"/>
+          <w:lang w:val="en-US" w:eastAsia="en-US" w:bidi="en-US"/>
+        </w:rPr>
+        <w:t>Please refine the figure legends. Buffer rather than buffer_ctrl, PCR rather than pcr_control</w:t>
+      </w:r>
+    </w:p>
+  </w:comment>
+  <w:comment w:id="13" w:author="Christoph Ammer-Herrmenau" w:date="2026-04-22T21:59:00Z" w:initials="CA">
+    <w:p>
+      <w:pPr>
+        <w:overflowPunct w:val="false"/>
+        <w:spacing w:before="0" w:after="0"/>
+        <w:rPr/>
+      </w:pPr>
+      <w:r>
+        <w:rPr>
+          <w:rFonts w:ascii="Liberation Serif" w:hAnsi="Liberation Serif" w:eastAsia="DejaVu Sans" w:cs="Noto Sans Arabic UI"/>
+          <w:lang w:val="en-US" w:eastAsia="en-US" w:bidi="en-US"/>
+        </w:rPr>
+        <w:t>I would always write a p-value + * if significant</w:t>
+      </w:r>
+    </w:p>
+    <w:p>
+      <w:pPr>
+        <w:overflowPunct w:val="false"/>
+        <w:spacing w:before="0" w:after="0"/>
+        <w:rPr/>
+      </w:pPr>
+      <w:r>
+        <w:rPr>
+          <w:rFonts w:ascii="Liberation Serif" w:hAnsi="Liberation Serif" w:eastAsia="DejaVu Sans" w:cs="Noto Sans Arabic UI"/>
+          <w:lang w:val="en-US" w:eastAsia="en-US" w:bidi="en-US"/>
+        </w:rPr>
+        <w:t>Please round p-values to 3 counts after comma like 0.034* or &lt; 0.001***</w:t>
+      </w:r>
+    </w:p>
+  </w:comment>
+  <w:comment w:id="14" w:author="Unknown Author" w:date="2026-05-29T10:07:22Z" w:initials="">
+    <w:p>
+      <w:pPr>
+        <w:overflowPunct w:val="false"/>
+        <w:spacing w:before="0" w:after="0"/>
+        <w:rPr/>
+      </w:pPr>
+      <w:r>
+        <w:rPr>
+          <w:rFonts w:ascii="Liberation Serif" w:hAnsi="Liberation Serif" w:eastAsia="DejaVu Sans" w:cs="Noto Sans Arabic UI"/>
+          <w:lang w:val="en-US" w:eastAsia="en-US" w:bidi="en-US"/>
+        </w:rPr>
+        <w:t>The story line here may be different (LD)</w:t>
+      </w:r>
+    </w:p>
+  </w:comment>
+  <w:comment w:id="15" w:author="Linh Dang" w:date="2026-07-06T18:35:02Z" w:initials="LD">
+    <w:p>
+      <w:pPr>
         <w:overflowPunct w:val="true"/>
         <w:spacing w:before="0" w:after="0"/>
         <w:rPr/>
       </w:pPr>
-      <w:hyperlink r:id="rId1">
-        <w:r>
-          <w:rPr>
-            <w:rFonts w:ascii="Liberation Serif" w:hAnsi="Liberation Serif" w:eastAsia="DejaVu Sans" w:cs="Noto Sans Arabic UI"/>
-            <w:lang w:val="en-US" w:eastAsia="en-US" w:bidi="en-US"/>
-          </w:rPr>
-          <w:t xml:space="preserve">https://doi.org/10.1158/2159-8290.CD-21-1059 </w:t>
-        </w:r>
-      </w:hyperlink>
+      <w:r>
+        <w:rPr>
+          <w:rFonts w:ascii="Liberation Serif" w:hAnsi="Liberation Serif" w:eastAsia="DejaVu Sans" w:cs="Noto Sans Arabic"/>
+          <w:lang w:val="en-US" w:eastAsia="en-US" w:bidi="en-US"/>
+        </w:rPr>
+        <w:t>We need a new story line here.</w:t>
+      </w:r>
     </w:p>
   </w:comment>
-  <w:comment w:id="1" w:author="Christoph Ammer-Herrmenau" w:date="2026-04-13T22:16:00Z" w:initials="CA">
-    <w:p>
-      <w:pPr>
-        <w:overflowPunct w:val="true"/>
-        <w:spacing w:before="0" w:after="0"/>
-        <w:rPr/>
-      </w:pPr>
-      <w:r>
-        <w:rPr>
-          <w:rFonts w:ascii="Liberation Serif" w:hAnsi="Liberation Serif" w:eastAsia="DejaVu Sans" w:cs="Noto Sans Arabic UI"/>
-          <w:lang w:val="en-US" w:eastAsia="en-US" w:bidi="en-US"/>
-        </w:rPr>
-        <w:t>Requilme et al, Pushalkar et al Nejman et al, Geller et al.</w:t>
-      </w:r>
-    </w:p>
-  </w:comment>
-  <w:comment w:id="2" w:author="Christoph Ammer-Herrmenau" w:date="2026-04-13T22:19:00Z" w:initials="CA">
-    <w:p>
-      <w:pPr>
-        <w:overflowPunct w:val="true"/>
-        <w:spacing w:before="0" w:after="0"/>
-        <w:rPr/>
-      </w:pPr>
-      <w:r>
-        <w:rPr>
-          <w:rFonts w:ascii="Liberation Serif" w:hAnsi="Liberation Serif" w:eastAsia="DejaVu Sans" w:cs="Noto Sans Arabic UI"/>
-          <w:lang w:val="en-US" w:eastAsia="en-US" w:bidi="en-US"/>
-        </w:rPr>
-        <w:t>Cell paper intratumoral microbiome.</w:t>
-      </w:r>
-    </w:p>
-  </w:comment>
-  <w:comment w:id="3" w:author="Christoph Ammer-Herrmenau" w:date="2026-04-22T21:34:00Z" w:initials="CA">
-    <w:p>
-      <w:pPr>
-        <w:overflowPunct w:val="true"/>
-        <w:spacing w:before="0" w:after="0"/>
-        <w:rPr/>
-      </w:pPr>
-      <w:r>
-        <w:rPr>
-          <w:rFonts w:ascii="Liberation Serif" w:hAnsi="Liberation Serif" w:eastAsia="DejaVu Sans" w:cs="Noto Sans Arabic UI"/>
-          <w:lang w:val="en-US" w:eastAsia="en-US" w:bidi="en-US"/>
-        </w:rPr>
-        <w:t>Better figure 1A, B etc.</w:t>
-      </w:r>
-    </w:p>
-  </w:comment>
-  <w:comment w:id="4" w:author="Christoph Ammer-Herrmenau" w:date="2026-04-22T21:34:00Z" w:initials="CA">
-    <w:p>
-      <w:pPr>
-        <w:overflowPunct w:val="true"/>
-        <w:spacing w:before="0" w:after="0"/>
-        <w:rPr/>
-      </w:pPr>
-      <w:r>
-        <w:rPr>
-          <w:rFonts w:ascii="Liberation Serif" w:hAnsi="Liberation Serif" w:eastAsia="DejaVu Sans" w:cs="Noto Sans Arabic UI"/>
-          <w:lang w:val="en-US" w:eastAsia="en-US" w:bidi="en-US"/>
-        </w:rPr>
-        <w:t>Here I identified more than 10 H2O controls in PDA-MAPS and P-MAPS has even more.</w:t>
-      </w:r>
-    </w:p>
-  </w:comment>
-  <w:comment w:id="6" w:author="Christoph Ammer-Herrmenau" w:date="2026-04-22T21:54:00Z" w:initials="CA">
-    <w:p>
-      <w:pPr>
-        <w:overflowPunct w:val="true"/>
-        <w:spacing w:before="0" w:after="0"/>
-        <w:rPr/>
-      </w:pPr>
-      <w:r>
-        <w:rPr>
-          <w:rFonts w:ascii="Liberation Serif" w:hAnsi="Liberation Serif" w:eastAsia="DejaVu Sans" w:cs="Noto Sans Arabic UI"/>
-          <w:lang w:val="en-US" w:eastAsia="en-US" w:bidi="en-US"/>
-        </w:rPr>
-        <w:t>I guess we should reevaluate the sample size too make the data more robust.</w:t>
-      </w:r>
-    </w:p>
-  </w:comment>
-  <w:comment w:id="5" w:author="Christoph Ammer-Herrmenau" w:date="2026-04-22T21:55:00Z" w:initials="CA">
-    <w:p>
-      <w:pPr>
-        <w:overflowPunct w:val="true"/>
-        <w:spacing w:before="0" w:after="0"/>
-        <w:rPr/>
-      </w:pPr>
-      <w:r>
-        <w:rPr>
-          <w:rFonts w:ascii="Liberation Serif" w:hAnsi="Liberation Serif" w:eastAsia="DejaVu Sans" w:cs="Noto Sans Arabic UI"/>
-          <w:lang w:val="en-US" w:eastAsia="en-US" w:bidi="en-US"/>
-        </w:rPr>
-        <w:t>Buffer and paraffin can remain like they are.</w:t>
-      </w:r>
-    </w:p>
-  </w:comment>
-  <w:comment w:id="7" w:author="Christoph Ammer-Herrmenau" w:date="2026-04-22T21:37:00Z" w:initials="CA">
-    <w:p>
-      <w:pPr>
-        <w:overflowPunct w:val="true"/>
-        <w:spacing w:before="0" w:after="0"/>
-        <w:rPr/>
-      </w:pPr>
-      <w:r>
-        <w:rPr>
-          <w:rFonts w:ascii="Liberation Serif" w:hAnsi="Liberation Serif" w:eastAsia="DejaVu Sans" w:cs="Noto Sans Arabic UI"/>
-          <w:lang w:val="en-US" w:eastAsia="en-US" w:bidi="en-US"/>
-        </w:rPr>
-        <w:t>I would define filter here as well.</w:t>
-      </w:r>
-    </w:p>
-  </w:comment>
-  <w:comment w:id="8" w:author="Christoph Ammer-Herrmenau" w:date="2026-04-22T21:40:00Z" w:initials="CA">
-    <w:p>
-      <w:pPr>
-        <w:overflowPunct w:val="true"/>
-        <w:spacing w:before="0" w:after="0"/>
-        <w:rPr/>
-      </w:pPr>
-      <w:r>
-        <w:rPr>
-          <w:rFonts w:ascii="Liberation Serif" w:hAnsi="Liberation Serif" w:eastAsia="DejaVu Sans" w:cs="Noto Sans Arabic UI"/>
-          <w:lang w:val="en-US" w:eastAsia="en-US" w:bidi="en-US"/>
-        </w:rPr>
-        <w:t>Figure 1B</w:t>
-      </w:r>
-    </w:p>
-  </w:comment>
-  <w:comment w:id="9" w:author="Christoph Ammer-Herrmenau" w:date="2026-04-23T21:35:00Z" w:initials="CA">
-    <w:p>
-      <w:pPr>
-        <w:overflowPunct w:val="true"/>
-        <w:spacing w:before="0" w:after="0"/>
-        <w:rPr/>
-      </w:pPr>
-      <w:r>
-        <w:rPr>
-          <w:rFonts w:ascii="Liberation Serif" w:hAnsi="Liberation Serif" w:eastAsia="DejaVu Sans" w:cs="Noto Sans Arabic UI"/>
-          <w:lang w:val="en-US" w:eastAsia="en-US" w:bidi="en-US"/>
-        </w:rPr>
-        <w:t>Do we have the alpha div for rarefaction or wrench normalization.</w:t>
-      </w:r>
-    </w:p>
-  </w:comment>
-  <w:comment w:id="10" w:author="Christoph Ammer-Herrmenau" w:date="2026-04-22T21:56:00Z" w:initials="CA">
-    <w:p>
-      <w:pPr>
-        <w:overflowPunct w:val="true"/>
-        <w:spacing w:before="0" w:after="0"/>
-        <w:rPr/>
-      </w:pPr>
-      <w:r>
-        <w:rPr>
-          <w:rFonts w:ascii="Liberation Serif" w:hAnsi="Liberation Serif" w:eastAsia="DejaVu Sans" w:cs="Noto Sans Arabic UI"/>
-          <w:lang w:val="en-US" w:eastAsia="en-US" w:bidi="en-US"/>
-        </w:rPr>
-        <w:t>Alpha- beta diversity?</w:t>
-      </w:r>
-    </w:p>
-  </w:comment>
-  <w:comment w:id="11" w:author="Christoph Ammer-Herrmenau" w:date="2026-04-22T21:57:00Z" w:initials="CA">
-    <w:p>
-      <w:pPr>
-        <w:overflowPunct w:val="true"/>
-        <w:spacing w:before="0" w:after="0"/>
-        <w:rPr/>
-      </w:pPr>
-      <w:r>
-        <w:rPr>
-          <w:rFonts w:ascii="Liberation Serif" w:hAnsi="Liberation Serif" w:eastAsia="DejaVu Sans" w:cs="Noto Sans Arabic UI"/>
-          <w:lang w:val="en-US" w:eastAsia="en-US" w:bidi="en-US"/>
-        </w:rPr>
-        <w:t>I would prefer to take only shannon OR Inv Simpson</w:t>
-      </w:r>
-    </w:p>
-  </w:comment>
-  <w:comment w:id="12" w:author="Christoph Ammer-Herrmenau" w:date="2026-04-22T21:58:00Z" w:initials="CA">
-    <w:p>
-      <w:pPr>
-        <w:overflowPunct w:val="true"/>
-        <w:spacing w:before="0" w:after="0"/>
-        <w:rPr/>
-      </w:pPr>
-      <w:r>
-        <w:rPr>
-          <w:rFonts w:ascii="Liberation Serif" w:hAnsi="Liberation Serif" w:eastAsia="DejaVu Sans" w:cs="Noto Sans Arabic UI"/>
-          <w:lang w:val="en-US" w:eastAsia="en-US" w:bidi="en-US"/>
-        </w:rPr>
-        <w:t>Please refine the figure legends. Buffer rather than buffer_ctrl, PCR rather than pcr_control</w:t>
-      </w:r>
-    </w:p>
-  </w:comment>
-  <w:comment w:id="13" w:author="Christoph Ammer-Herrmenau" w:date="2026-04-22T21:59:00Z" w:initials="CA">
-    <w:p>
-      <w:pPr>
-        <w:overflowPunct w:val="true"/>
-        <w:spacing w:before="0" w:after="0"/>
-        <w:rPr/>
-      </w:pPr>
-      <w:r>
-        <w:rPr>
-          <w:rFonts w:ascii="Liberation Serif" w:hAnsi="Liberation Serif" w:eastAsia="DejaVu Sans" w:cs="Noto Sans Arabic UI"/>
-          <w:lang w:val="en-US" w:eastAsia="en-US" w:bidi="en-US"/>
-        </w:rPr>
-        <w:t>I would always write a p-value + * if significant</w:t>
-      </w:r>
-    </w:p>
-    <w:p>
-      <w:pPr>
-        <w:overflowPunct w:val="true"/>
-        <w:spacing w:before="0" w:after="0"/>
-        <w:rPr/>
-      </w:pPr>
-      <w:r>
-        <w:rPr>
-          <w:rFonts w:ascii="Liberation Serif" w:hAnsi="Liberation Serif" w:eastAsia="DejaVu Sans" w:cs="Noto Sans Arabic UI"/>
-          <w:lang w:val="en-US" w:eastAsia="en-US" w:bidi="en-US"/>
-        </w:rPr>
-        <w:t>Please round p-values to 3 counts after comma like 0.034* or &lt; 0.001***</w:t>
-      </w:r>
-    </w:p>
-  </w:comment>
-  <w:comment w:id="14" w:author="Unknown Author" w:date="2026-05-29T10:07:22Z" w:initials="">
-    <w:p>
-      <w:pPr>
-        <w:overflowPunct w:val="true"/>
-        <w:spacing w:before="0" w:after="0"/>
-        <w:rPr/>
-      </w:pPr>
-      <w:r>
-        <w:rPr>
-          <w:rFonts w:ascii="Liberation Serif" w:hAnsi="Liberation Serif" w:eastAsia="DejaVu Sans" w:cs="Noto Sans Arabic UI"/>
-          <w:lang w:val="en-US" w:eastAsia="en-US" w:bidi="en-US"/>
-        </w:rPr>
-        <w:t>The story line here may be different (LD)</w:t>
-      </w:r>
-    </w:p>
-  </w:comment>
-  <w:comment w:id="15" w:author="Linh Dang" w:date="2026-07-06T18:35:02Z" w:initials="LD">
+  <w:comment w:id="16" w:author="Christoph Ammer-Herrmenau" w:date="2026-04-23T21:33:00Z" w:initials="CA">
     <w:p>
       <w:pPr>
         <w:overflowPunct w:val="false"/>
@@ -7721,22 +7934,6 @@
       </w:pPr>
       <w:r>
         <w:rPr>
-          <w:rFonts w:ascii="Liberation Serif" w:hAnsi="Liberation Serif" w:eastAsia="DejaVu Sans" w:cs="Noto Sans Arabic"/>
-          <w:lang w:val="en-US" w:eastAsia="en-US" w:bidi="en-US"/>
-        </w:rPr>
-        <w:t>We need a new story line here.</w:t>
-      </w:r>
-    </w:p>
-  </w:comment>
-  <w:comment w:id="16" w:author="Christoph Ammer-Herrmenau" w:date="2026-04-23T21:33:00Z" w:initials="CA">
-    <w:p>
-      <w:pPr>
-        <w:overflowPunct w:val="true"/>
-        <w:spacing w:before="0" w:after="0"/>
-        <w:rPr/>
-      </w:pPr>
-      <w:r>
-        <w:rPr>
           <w:rFonts w:ascii="Liberation Serif" w:hAnsi="Liberation Serif" w:eastAsia="DejaVu Sans" w:cs="Noto Sans Arabic UI"/>
           <w:lang w:val="en-US" w:eastAsia="en-US" w:bidi="en-US"/>
         </w:rPr>
@@ -7747,7 +7944,7 @@
   <w:comment w:id="17" w:author="Christoph Ammer-Herrmenau" w:date="2026-04-23T21:43:00Z" w:initials="CA">
     <w:p>
       <w:pPr>
-        <w:overflowPunct w:val="true"/>
+        <w:overflowPunct w:val="false"/>
         <w:spacing w:before="0" w:after="0"/>
         <w:rPr/>
       </w:pPr>
@@ -7779,7 +7976,7 @@
   <w:comment w:id="18" w:author="Christoph Ammer-Herrmenau" w:date="2026-04-23T21:40:00Z" w:initials="CA">
     <w:p>
       <w:pPr>
-        <w:overflowPunct w:val="true"/>
+        <w:overflowPunct w:val="false"/>
         <w:spacing w:before="0" w:after="0"/>
         <w:rPr/>
       </w:pPr>
@@ -7795,7 +7992,7 @@
   <w:comment w:id="19" w:author="Linh Dang" w:date="2026-06-03T15:48:43Z" w:initials="LD">
     <w:p>
       <w:pPr>
-        <w:overflowPunct w:val="false"/>
+        <w:overflowPunct w:val="true"/>
         <w:spacing w:before="0" w:after="0"/>
         <w:rPr/>
       </w:pPr>
@@ -7811,23 +8008,39 @@
     </w:p>
     <w:p>
       <w:pPr>
+        <w:overflowPunct w:val="true"/>
+        <w:spacing w:before="0" w:after="0"/>
+        <w:rPr/>
+      </w:pPr>
+      <w:r>
+        <w:rPr>
+          <w:rFonts w:ascii="Liberation Serif" w:hAnsi="Liberation Serif" w:eastAsia="DejaVu Sans" w:cs="Noto Sans Arabic"/>
+          <w:lang w:val="en-US" w:eastAsia="en-US" w:bidi="en-US"/>
+        </w:rPr>
+        <w:t>Agreed :)</w:t>
+      </w:r>
+    </w:p>
+  </w:comment>
+  <w:comment w:id="20" w:author="Christoph Ammer-Herrmenau" w:date="2026-04-23T21:40:00Z" w:initials="CA">
+    <w:p>
+      <w:pPr>
         <w:overflowPunct w:val="false"/>
         <w:spacing w:before="0" w:after="0"/>
         <w:rPr/>
       </w:pPr>
       <w:r>
         <w:rPr>
-          <w:rFonts w:ascii="Liberation Serif" w:hAnsi="Liberation Serif" w:eastAsia="DejaVu Sans" w:cs="Noto Sans Arabic"/>
+          <w:rFonts w:ascii="Liberation Serif" w:hAnsi="Liberation Serif" w:eastAsia="DejaVu Sans" w:cs="Noto Sans Arabic UI"/>
           <w:lang w:val="en-US" w:eastAsia="en-US" w:bidi="en-US"/>
         </w:rPr>
-        <w:t>Agreed :)</w:t>
+        <w:t>Very well written!!</w:t>
       </w:r>
     </w:p>
   </w:comment>
-  <w:comment w:id="20" w:author="Christoph Ammer-Herrmenau" w:date="2026-04-23T21:40:00Z" w:initials="CA">
-    <w:p>
-      <w:pPr>
-        <w:overflowPunct w:val="true"/>
+  <w:comment w:id="21" w:author="Christoph Ammer-Herrmenau" w:date="2026-04-23T21:45:00Z" w:initials="CA">
+    <w:p>
+      <w:pPr>
+        <w:overflowPunct w:val="false"/>
         <w:spacing w:before="0" w:after="0"/>
         <w:rPr/>
       </w:pPr>
@@ -7836,22 +8049,6 @@
           <w:rFonts w:ascii="Liberation Serif" w:hAnsi="Liberation Serif" w:eastAsia="DejaVu Sans" w:cs="Noto Sans Arabic UI"/>
           <w:lang w:val="en-US" w:eastAsia="en-US" w:bidi="en-US"/>
         </w:rPr>
-        <w:t>Very well written!!</w:t>
-      </w:r>
-    </w:p>
-  </w:comment>
-  <w:comment w:id="21" w:author="Christoph Ammer-Herrmenau" w:date="2026-04-23T21:45:00Z" w:initials="CA">
-    <w:p>
-      <w:pPr>
-        <w:overflowPunct w:val="true"/>
-        <w:spacing w:before="0" w:after="0"/>
-        <w:rPr/>
-      </w:pPr>
-      <w:r>
-        <w:rPr>
-          <w:rFonts w:ascii="Liberation Serif" w:hAnsi="Liberation Serif" w:eastAsia="DejaVu Sans" w:cs="Noto Sans Arabic UI"/>
-          <w:lang w:val="en-US" w:eastAsia="en-US" w:bidi="en-US"/>
-        </w:rPr>
         <w:t>In order to reduce complexity of this complex work Iwould remove the analysis on phylum level. We focused on genus level, which is by far much more specific.</w:t>
       </w:r>
     </w:p>
@@ -7859,7 +8056,7 @@
   <w:comment w:id="22" w:author="Linh Dang" w:date="2026-06-03T15:49:17Z" w:initials="LD">
     <w:p>
       <w:pPr>
-        <w:overflowPunct w:val="false"/>
+        <w:overflowPunct w:val="true"/>
         <w:spacing w:before="0" w:after="0"/>
         <w:rPr/>
       </w:pPr>
@@ -7875,23 +8072,39 @@
     </w:p>
     <w:p>
       <w:pPr>
+        <w:overflowPunct w:val="true"/>
+        <w:spacing w:before="0" w:after="0"/>
+        <w:rPr/>
+      </w:pPr>
+      <w:r>
+        <w:rPr>
+          <w:rFonts w:ascii="Liberation Serif" w:hAnsi="Liberation Serif" w:eastAsia="DejaVu Sans" w:cs="Noto Sans Arabic"/>
+          <w:lang w:val="en-US" w:eastAsia="en-US" w:bidi="en-US"/>
+        </w:rPr>
+        <w:t>Agreed!!</w:t>
+      </w:r>
+    </w:p>
+  </w:comment>
+  <w:comment w:id="23" w:author="Christoph Ammer-Herrmenau" w:date="2026-04-23T21:50:00Z" w:initials="CA">
+    <w:p>
+      <w:pPr>
         <w:overflowPunct w:val="false"/>
         <w:spacing w:before="0" w:after="0"/>
         <w:rPr/>
       </w:pPr>
       <w:r>
         <w:rPr>
-          <w:rFonts w:ascii="Liberation Serif" w:hAnsi="Liberation Serif" w:eastAsia="DejaVu Sans" w:cs="Noto Sans Arabic"/>
+          <w:rFonts w:ascii="Liberation Serif" w:hAnsi="Liberation Serif" w:eastAsia="DejaVu Sans" w:cs="Noto Sans Arabic UI"/>
           <w:lang w:val="en-US" w:eastAsia="en-US" w:bidi="en-US"/>
         </w:rPr>
-        <w:t>Agreed!!</w:t>
+        <w:t>As mentioned above, I do not see the rationale to explore higher taxonomic ranks. Maybe it would be worth to have a lookt to the domiant species as our method allows robust analysis on species level.</w:t>
       </w:r>
     </w:p>
   </w:comment>
-  <w:comment w:id="23" w:author="Christoph Ammer-Herrmenau" w:date="2026-04-23T21:50:00Z" w:initials="CA">
-    <w:p>
-      <w:pPr>
-        <w:overflowPunct w:val="true"/>
+  <w:comment w:id="24" w:author="Linh Dang" w:date="2026-06-04T12:52:45Z" w:initials="LD">
+    <w:p>
+      <w:pPr>
+        <w:overflowPunct w:val="false"/>
         <w:spacing w:before="0" w:after="0"/>
         <w:rPr/>
       </w:pPr>
@@ -7900,14 +8113,14 @@
           <w:rFonts w:ascii="Liberation Serif" w:hAnsi="Liberation Serif" w:eastAsia="DejaVu Sans" w:cs="Noto Sans Arabic UI"/>
           <w:lang w:val="en-US" w:eastAsia="en-US" w:bidi="en-US"/>
         </w:rPr>
-        <w:t>As mentioned above, I do not see the rationale to explore higher taxonomic ranks. Maybe it would be worth to have a lookt to the domiant species as our method allows robust analysis on species level.</w:t>
+        <w:t>Question: the default option in MaAslin2 not for pairwise comparison, but rather compare one to a reference. In this case, we have: paraffin vs. PCR and Buffer vs. PCR. Is it also interesting to do: Paraffin vs. the rest, Buffer vs. the rest, and PCR vs. the rest.</w:t>
       </w:r>
     </w:p>
   </w:comment>
-  <w:comment w:id="24" w:author="Linh Dang" w:date="2026-06-04T12:52:45Z" w:initials="LD">
-    <w:p>
-      <w:pPr>
-        <w:overflowPunct w:val="true"/>
+  <w:comment w:id="25" w:author="Christoph Ammer-Herrmenau" w:date="2026-04-23T21:54:00Z" w:initials="CA">
+    <w:p>
+      <w:pPr>
+        <w:overflowPunct w:val="false"/>
         <w:spacing w:before="0" w:after="0"/>
         <w:rPr/>
       </w:pPr>
@@ -7916,14 +8129,14 @@
           <w:rFonts w:ascii="Liberation Serif" w:hAnsi="Liberation Serif" w:eastAsia="DejaVu Sans" w:cs="Noto Sans Arabic UI"/>
           <w:lang w:val="en-US" w:eastAsia="en-US" w:bidi="en-US"/>
         </w:rPr>
-        <w:t>Question: the default option in MaAslin2 not for pairwise comparison, but rather compare one to a reference. In this case, we have: paraffin vs. PCR and Buffer vs. PCR. Is it also interesting to do: Paraffin vs. the rest, Buffer vs. the rest, and PCR vs. the rest.</w:t>
+        <w:t>Also here I would ratheruse the species level. If there are too many species  we can use a suppl table. Why have you not used MaAsLin2 and stratified for LP, origin paraffin, buffer etc? If there are multiple species dominant in LP we can take it as a smooth bridge to the second chapter.</w:t>
       </w:r>
     </w:p>
   </w:comment>
-  <w:comment w:id="25" w:author="Christoph Ammer-Herrmenau" w:date="2026-04-23T21:54:00Z" w:initials="CA">
-    <w:p>
-      <w:pPr>
-        <w:overflowPunct w:val="true"/>
+  <w:comment w:id="26" w:author="Christoph Ammer-Herrmenau" w:date="2026-04-24T21:14:00Z" w:initials="CA">
+    <w:p>
+      <w:pPr>
+        <w:overflowPunct w:val="false"/>
         <w:spacing w:before="0" w:after="0"/>
         <w:rPr/>
       </w:pPr>
@@ -7932,14 +8145,14 @@
           <w:rFonts w:ascii="Liberation Serif" w:hAnsi="Liberation Serif" w:eastAsia="DejaVu Sans" w:cs="Noto Sans Arabic UI"/>
           <w:lang w:val="en-US" w:eastAsia="en-US" w:bidi="en-US"/>
         </w:rPr>
-        <w:t>Also here I would ratheruse the species level. If there are too many species  we can use a suppl table. Why have you not used MaAsLin2 and stratified for LP, origin paraffin, buffer etc? If there are multiple species dominant in LP we can take it as a smooth bridge to the second chapter.</w:t>
+        <w:t xml:space="preserve">I expanded the description here, as most reviewer do not read thoroughly the methods and go directely to the results. </w:t>
       </w:r>
     </w:p>
   </w:comment>
-  <w:comment w:id="26" w:author="Christoph Ammer-Herrmenau" w:date="2026-04-24T21:14:00Z" w:initials="CA">
-    <w:p>
-      <w:pPr>
-        <w:overflowPunct w:val="true"/>
+  <w:comment w:id="28" w:author="Christoph Ammer-Herrmenau" w:date="2026-04-24T22:59:00Z" w:initials="CA">
+    <w:p>
+      <w:pPr>
+        <w:overflowPunct w:val="false"/>
         <w:spacing w:before="0" w:after="0"/>
         <w:rPr/>
       </w:pPr>
@@ -7948,22 +8161,6 @@
           <w:rFonts w:ascii="Liberation Serif" w:hAnsi="Liberation Serif" w:eastAsia="DejaVu Sans" w:cs="Noto Sans Arabic UI"/>
           <w:lang w:val="en-US" w:eastAsia="en-US" w:bidi="en-US"/>
         </w:rPr>
-        <w:t xml:space="preserve">I expanded the description here, as most reviewer do not read thoroughly the methods and go directely to the results. </w:t>
-      </w:r>
-    </w:p>
-  </w:comment>
-  <w:comment w:id="28" w:author="Christoph Ammer-Herrmenau" w:date="2026-04-24T22:59:00Z" w:initials="CA">
-    <w:p>
-      <w:pPr>
-        <w:overflowPunct w:val="true"/>
-        <w:spacing w:before="0" w:after="0"/>
-        <w:rPr/>
-      </w:pPr>
-      <w:r>
-        <w:rPr>
-          <w:rFonts w:ascii="Liberation Serif" w:hAnsi="Liberation Serif" w:eastAsia="DejaVu Sans" w:cs="Noto Sans Arabic UI"/>
-          <w:lang w:val="en-US" w:eastAsia="en-US" w:bidi="en-US"/>
-        </w:rPr>
         <w:t>Please relabel technician to LP, and bench hood to low-germ and standard an the figures.</w:t>
       </w:r>
     </w:p>
@@ -7971,7 +8168,7 @@
   <w:comment w:id="29" w:author="Linh Dang" w:date="2026-06-11T09:33:44Z" w:initials="LD">
     <w:p>
       <w:pPr>
-        <w:overflowPunct w:val="true"/>
+        <w:overflowPunct w:val="false"/>
         <w:spacing w:before="0" w:after="0"/>
         <w:rPr/>
       </w:pPr>
@@ -7987,7 +8184,7 @@
     </w:p>
     <w:p>
       <w:pPr>
-        <w:overflowPunct w:val="true"/>
+        <w:overflowPunct w:val="false"/>
         <w:spacing w:before="0" w:after="0"/>
         <w:rPr/>
       </w:pPr>
@@ -8003,7 +8200,7 @@
   <w:comment w:id="27" w:author="Christoph Ammer-Herrmenau" w:date="2026-04-24T23:00:00Z" w:initials="CA">
     <w:p>
       <w:pPr>
-        <w:overflowPunct w:val="true"/>
+        <w:overflowPunct w:val="false"/>
         <w:spacing w:before="0" w:after="0"/>
         <w:rPr/>
       </w:pPr>
@@ -8019,7 +8216,7 @@
   <w:comment w:id="30" w:author="Linh Dang" w:date="2026-06-11T09:34:00Z" w:initials="LD">
     <w:p>
       <w:pPr>
-        <w:overflowPunct w:val="true"/>
+        <w:overflowPunct w:val="false"/>
         <w:spacing w:before="0" w:after="0"/>
         <w:rPr/>
       </w:pPr>
@@ -8035,7 +8232,7 @@
     </w:p>
     <w:p>
       <w:pPr>
-        <w:overflowPunct w:val="true"/>
+        <w:overflowPunct w:val="false"/>
         <w:spacing w:before="0" w:after="0"/>
         <w:rPr/>
       </w:pPr>
@@ -8051,7 +8248,7 @@
   <w:comment w:id="31" w:author="Linh Dang" w:date="2026-06-17T15:10:47Z" w:initials="LD">
     <w:p>
       <w:pPr>
-        <w:overflowPunct w:val="true"/>
+        <w:overflowPunct w:val="false"/>
         <w:spacing w:before="0" w:after="0"/>
         <w:rPr/>
       </w:pPr>
@@ -8067,7 +8264,7 @@
   <w:comment w:id="32" w:author="Christoph Ammer-Herrmenau" w:date="2026-04-24T21:06:00Z" w:initials="CA">
     <w:p>
       <w:pPr>
-        <w:overflowPunct w:val="true"/>
+        <w:overflowPunct w:val="false"/>
         <w:spacing w:before="0" w:after="0"/>
         <w:rPr/>
       </w:pPr>
@@ -8083,7 +8280,7 @@
   <w:comment w:id="33" w:author="Linh Dang" w:date="2026-06-11T09:50:53Z" w:initials="LD">
     <w:p>
       <w:pPr>
-        <w:overflowPunct w:val="true"/>
+        <w:overflowPunct w:val="false"/>
         <w:spacing w:before="0" w:after="0"/>
         <w:rPr/>
       </w:pPr>
@@ -8099,7 +8296,7 @@
     </w:p>
     <w:p>
       <w:pPr>
-        <w:overflowPunct w:val="true"/>
+        <w:overflowPunct w:val="false"/>
         <w:spacing w:before="0" w:after="0"/>
         <w:rPr/>
       </w:pPr>
@@ -8113,7 +8310,7 @@
     </w:p>
     <w:p>
       <w:pPr>
-        <w:overflowPunct w:val="true"/>
+        <w:overflowPunct w:val="false"/>
         <w:spacing w:before="0" w:after="0"/>
         <w:rPr/>
       </w:pPr>
@@ -8128,7 +8325,7 @@
   <w:comment w:id="34" w:author="Christoph Ammer-Herrmenau" w:date="2026-04-24T23:01:00Z" w:initials="CA">
     <w:p>
       <w:pPr>
-        <w:overflowPunct w:val="true"/>
+        <w:overflowPunct w:val="false"/>
         <w:spacing w:before="0" w:after="0"/>
         <w:rPr/>
       </w:pPr>
@@ -8144,7 +8341,7 @@
   <w:comment w:id="35" w:author="Christoph Ammer-Herrmenau" w:date="2026-04-24T21:09:00Z" w:initials="CA">
     <w:p>
       <w:pPr>
-        <w:overflowPunct w:val="true"/>
+        <w:overflowPunct w:val="false"/>
         <w:spacing w:before="0" w:after="0"/>
         <w:rPr/>
       </w:pPr>
@@ -8160,7 +8357,7 @@
   <w:comment w:id="36" w:author="Christoph Ammer-Herrmenau" w:date="2026-04-24T21:07:00Z" w:initials="CA">
     <w:p>
       <w:pPr>
-        <w:overflowPunct w:val="true"/>
+        <w:overflowPunct w:val="false"/>
         <w:spacing w:before="0" w:after="0"/>
         <w:rPr/>
       </w:pPr>
@@ -8176,7 +8373,7 @@
   <w:comment w:id="37" w:author="Christoph Ammer-Herrmenau" w:date="2026-04-24T21:13:00Z" w:initials="CA">
     <w:p>
       <w:pPr>
-        <w:overflowPunct w:val="true"/>
+        <w:overflowPunct w:val="false"/>
         <w:spacing w:before="0" w:after="0"/>
         <w:rPr/>
       </w:pPr>
@@ -8192,7 +8389,7 @@
   <w:comment w:id="38" w:author="Christoph Ammer-Herrmenau" w:date="2026-04-24T21:11:00Z" w:initials="CA">
     <w:p>
       <w:pPr>
-        <w:overflowPunct w:val="true"/>
+        <w:overflowPunct w:val="false"/>
         <w:spacing w:before="0" w:after="0"/>
         <w:rPr/>
       </w:pPr>
@@ -8208,7 +8405,7 @@
   <w:comment w:id="39" w:author="Christoph Ammer-Herrmenau" w:date="2026-04-24T21:14:00Z" w:initials="CA">
     <w:p>
       <w:pPr>
-        <w:overflowPunct w:val="true"/>
+        <w:overflowPunct w:val="false"/>
         <w:spacing w:before="0" w:after="0"/>
         <w:rPr/>
       </w:pPr>
@@ -8224,7 +8421,7 @@
   <w:comment w:id="40" w:author="Christoph Ammer-Herrmenau" w:date="2026-04-24T23:03:00Z" w:initials="CA">
     <w:p>
       <w:pPr>
-        <w:overflowPunct w:val="true"/>
+        <w:overflowPunct w:val="false"/>
         <w:spacing w:before="0" w:after="0"/>
         <w:rPr/>
       </w:pPr>
@@ -8240,7 +8437,7 @@
   <w:comment w:id="41" w:author="Christoph Ammer-Herrmenau" w:date="2026-04-25T21:02:00Z" w:initials="CA">
     <w:p>
       <w:pPr>
-        <w:overflowPunct w:val="true"/>
+        <w:overflowPunct w:val="false"/>
         <w:spacing w:before="0" w:after="0"/>
         <w:rPr/>
       </w:pPr>
@@ -8256,7 +8453,7 @@
   <w:comment w:id="42" w:author="Christoph Ammer-Herrmenau" w:date="2026-04-25T21:20:00Z" w:initials="CA">
     <w:p>
       <w:pPr>
-        <w:overflowPunct w:val="true"/>
+        <w:overflowPunct w:val="false"/>
         <w:spacing w:before="0" w:after="0"/>
         <w:rPr/>
       </w:pPr>
@@ -8272,7 +8469,7 @@
   <w:comment w:id="43" w:author="Christoph Ammer-Herrmenau" w:date="2026-04-25T21:21:00Z" w:initials="CA">
     <w:p>
       <w:pPr>
-        <w:overflowPunct w:val="true"/>
+        <w:overflowPunct w:val="false"/>
         <w:spacing w:before="0" w:after="0"/>
         <w:rPr/>
       </w:pPr>
@@ -8288,7 +8485,7 @@
   <w:comment w:id="44" w:author="Christoph Ammer-Herrmenau" w:date="2026-04-25T21:21:00Z" w:initials="CA">
     <w:p>
       <w:pPr>
-        <w:overflowPunct w:val="true"/>
+        <w:overflowPunct w:val="false"/>
         <w:spacing w:before="0" w:after="0"/>
         <w:rPr/>
       </w:pPr>
@@ -8304,7 +8501,7 @@
   <w:comment w:id="45" w:author="Linh Dang" w:date="2026-07-06T10:51:12Z" w:initials="LD">
     <w:p>
       <w:pPr>
-        <w:overflowPunct w:val="false"/>
+        <w:overflowPunct w:val="true"/>
         <w:spacing w:before="0" w:after="0"/>
         <w:rPr/>
       </w:pPr>
@@ -8320,20 +8517,52 @@
     </w:p>
     <w:p>
       <w:pPr>
+        <w:overflowPunct w:val="true"/>
+        <w:spacing w:before="0" w:after="0"/>
+        <w:rPr/>
+      </w:pPr>
+      <w:r>
+        <w:rPr>
+          <w:rFonts w:ascii="Liberation Serif" w:hAnsi="Liberation Serif" w:eastAsia="DejaVu Sans" w:cs="Noto Sans Arabic"/>
+          <w:lang w:val="en-US" w:eastAsia="en-US" w:bidi="en-US"/>
+        </w:rPr>
+        <w:t>Why would it belong to the discussion? The longitudinal NCT is an essential part for the assessment.</w:t>
+      </w:r>
+    </w:p>
+  </w:comment>
+  <w:comment w:id="46" w:author="Linh Dang" w:date="2026-07-06T12:21:51Z" w:initials="LD">
+    <w:p>
+      <w:pPr>
+        <w:overflowPunct w:val="true"/>
+        <w:spacing w:before="0" w:after="0"/>
+        <w:rPr/>
+      </w:pPr>
+      <w:r>
+        <w:rPr>
+          <w:rFonts w:ascii="Liberation Serif" w:hAnsi="Liberation Serif" w:eastAsia="DejaVu Sans" w:cs="Noto Sans Arabic"/>
+          <w:lang w:val="en-US" w:eastAsia="en-US" w:bidi="en-US"/>
+        </w:rPr>
+        <w:t>For the consistency, I only use paired Wilcox test to compare decontamination methods.</w:t>
+      </w:r>
+    </w:p>
+  </w:comment>
+  <w:comment w:id="47" w:author="Christoph Ammer-Herrmenau" w:date="2026-04-25T21:45:00Z" w:initials="CA">
+    <w:p>
+      <w:pPr>
         <w:overflowPunct w:val="false"/>
         <w:spacing w:before="0" w:after="0"/>
         <w:rPr/>
       </w:pPr>
       <w:r>
         <w:rPr>
-          <w:rFonts w:ascii="Liberation Serif" w:hAnsi="Liberation Serif" w:eastAsia="DejaVu Sans" w:cs="Noto Sans Arabic"/>
+          <w:rFonts w:ascii="Liberation Serif" w:hAnsi="Liberation Serif" w:eastAsia="DejaVu Sans" w:cs="Noto Sans Arabic UI"/>
           <w:lang w:val="en-US" w:eastAsia="en-US" w:bidi="en-US"/>
         </w:rPr>
-        <w:t>Why would it belong to the discussion? The longitudinal NCT is an essential part for the assessment.</w:t>
+        <w:t>The pairwise comparison needs to be in the supplemental material</w:t>
       </w:r>
     </w:p>
   </w:comment>
-  <w:comment w:id="46" w:author="Linh Dang" w:date="2026-07-06T12:21:51Z" w:initials="LD">
+  <w:comment w:id="49" w:author="Christoph Ammer-Herrmenau" w:date="2026-04-25T21:50:00Z" w:initials="CA">
     <w:p>
       <w:pPr>
         <w:overflowPunct w:val="false"/>
@@ -8342,17 +8571,17 @@
       </w:pPr>
       <w:r>
         <w:rPr>
-          <w:rFonts w:ascii="Liberation Serif" w:hAnsi="Liberation Serif" w:eastAsia="DejaVu Sans" w:cs="Noto Sans Arabic"/>
+          <w:rFonts w:ascii="Liberation Serif" w:hAnsi="Liberation Serif" w:eastAsia="DejaVu Sans" w:cs="Noto Sans Arabic UI"/>
           <w:lang w:val="en-US" w:eastAsia="en-US" w:bidi="en-US"/>
         </w:rPr>
-        <w:t>For the consistency, I only use paired Wilcox test to compare decontamination methods.</w:t>
+        <w:t>Pairwise comparison</w:t>
       </w:r>
     </w:p>
   </w:comment>
-  <w:comment w:id="47" w:author="Christoph Ammer-Herrmenau" w:date="2026-04-25T21:45:00Z" w:initials="CA">
-    <w:p>
-      <w:pPr>
-        <w:overflowPunct w:val="true"/>
+  <w:comment w:id="48" w:author="Christoph Ammer-Herrmenau" w:date="2026-04-25T21:52:00Z" w:initials="CA">
+    <w:p>
+      <w:pPr>
+        <w:overflowPunct w:val="false"/>
         <w:spacing w:before="0" w:after="0"/>
         <w:rPr/>
       </w:pPr>
@@ -8361,14 +8590,14 @@
           <w:rFonts w:ascii="Liberation Serif" w:hAnsi="Liberation Serif" w:eastAsia="DejaVu Sans" w:cs="Noto Sans Arabic UI"/>
           <w:lang w:val="en-US" w:eastAsia="en-US" w:bidi="en-US"/>
         </w:rPr>
-        <w:t>The pairwise comparison needs to be in the supplemental material</w:t>
+        <w:t xml:space="preserve">Are above data with rarefation or wrench? We should report the second normalization technique. Please expand in figure legends the abbreviations, the sample size and the normalization techniques in all figures. </w:t>
       </w:r>
     </w:p>
   </w:comment>
-  <w:comment w:id="49" w:author="Christoph Ammer-Herrmenau" w:date="2026-04-25T21:50:00Z" w:initials="CA">
-    <w:p>
-      <w:pPr>
-        <w:overflowPunct w:val="true"/>
+  <w:comment w:id="50" w:author="Christoph Ammer-Herrmenau" w:date="2026-04-25T21:47:00Z" w:initials="CA">
+    <w:p>
+      <w:pPr>
+        <w:overflowPunct w:val="false"/>
         <w:spacing w:before="0" w:after="0"/>
         <w:rPr/>
       </w:pPr>
@@ -8377,14 +8606,14 @@
           <w:rFonts w:ascii="Liberation Serif" w:hAnsi="Liberation Serif" w:eastAsia="DejaVu Sans" w:cs="Noto Sans Arabic UI"/>
           <w:lang w:val="en-US" w:eastAsia="en-US" w:bidi="en-US"/>
         </w:rPr>
-        <w:t>Pairwise comparison</w:t>
+        <w:t>I would exclude this as non-parametric tests are less sophisticated as LMM and does not bring additional informatuion.</w:t>
       </w:r>
     </w:p>
   </w:comment>
-  <w:comment w:id="48" w:author="Christoph Ammer-Herrmenau" w:date="2026-04-25T21:52:00Z" w:initials="CA">
-    <w:p>
-      <w:pPr>
-        <w:overflowPunct w:val="true"/>
+  <w:comment w:id="51" w:author="Christoph Ammer-Herrmenau" w:date="2026-04-25T22:00:00Z" w:initials="CA">
+    <w:p>
+      <w:pPr>
+        <w:overflowPunct w:val="false"/>
         <w:spacing w:before="0" w:after="0"/>
         <w:rPr/>
       </w:pPr>
@@ -8393,14 +8622,14 @@
           <w:rFonts w:ascii="Liberation Serif" w:hAnsi="Liberation Serif" w:eastAsia="DejaVu Sans" w:cs="Noto Sans Arabic UI"/>
           <w:lang w:val="en-US" w:eastAsia="en-US" w:bidi="en-US"/>
         </w:rPr>
-        <w:t xml:space="preserve">Are above data with rarefation or wrench? We should report the second normalization technique. Please expand in figure legends the abbreviations, the sample size and the normalization techniques in all figures. </w:t>
+        <w:t>Pairwise comparison</w:t>
       </w:r>
     </w:p>
   </w:comment>
-  <w:comment w:id="50" w:author="Christoph Ammer-Herrmenau" w:date="2026-04-25T21:47:00Z" w:initials="CA">
-    <w:p>
-      <w:pPr>
-        <w:overflowPunct w:val="true"/>
+  <w:comment w:id="52" w:author="Christoph Ammer-Herrmenau" w:date="2026-04-25T22:01:00Z" w:initials="CA">
+    <w:p>
+      <w:pPr>
+        <w:overflowPunct w:val="false"/>
         <w:spacing w:before="0" w:after="0"/>
         <w:rPr/>
       </w:pPr>
@@ -8409,14 +8638,14 @@
           <w:rFonts w:ascii="Liberation Serif" w:hAnsi="Liberation Serif" w:eastAsia="DejaVu Sans" w:cs="Noto Sans Arabic UI"/>
           <w:lang w:val="en-US" w:eastAsia="en-US" w:bidi="en-US"/>
         </w:rPr>
-        <w:t>I would exclude this as non-parametric tests are less sophisticated as LMM and does not bring additional informatuion.</w:t>
+        <w:t>Were the data from figure 3B not normalized?</w:t>
       </w:r>
     </w:p>
   </w:comment>
-  <w:comment w:id="51" w:author="Christoph Ammer-Herrmenau" w:date="2026-04-25T22:00:00Z" w:initials="CA">
-    <w:p>
-      <w:pPr>
-        <w:overflowPunct w:val="true"/>
+  <w:comment w:id="53" w:author="Christoph Ammer-Herrmenau" w:date="2026-04-25T22:09:00Z" w:initials="CA">
+    <w:p>
+      <w:pPr>
+        <w:overflowPunct w:val="false"/>
         <w:spacing w:before="0" w:after="0"/>
         <w:rPr/>
       </w:pPr>
@@ -8425,14 +8654,14 @@
           <w:rFonts w:ascii="Liberation Serif" w:hAnsi="Liberation Serif" w:eastAsia="DejaVu Sans" w:cs="Noto Sans Arabic UI"/>
           <w:lang w:val="en-US" w:eastAsia="en-US" w:bidi="en-US"/>
         </w:rPr>
-        <w:t>Pairwise comparison</w:t>
+        <w:t>Please rephrase.</w:t>
       </w:r>
     </w:p>
   </w:comment>
-  <w:comment w:id="52" w:author="Christoph Ammer-Herrmenau" w:date="2026-04-25T22:01:00Z" w:initials="CA">
-    <w:p>
-      <w:pPr>
-        <w:overflowPunct w:val="true"/>
+  <w:comment w:id="54" w:author="Christoph Ammer-Herrmenau" w:date="2026-04-25T22:24:00Z" w:initials="CA">
+    <w:p>
+      <w:pPr>
+        <w:overflowPunct w:val="false"/>
         <w:spacing w:before="0" w:after="0"/>
         <w:rPr/>
       </w:pPr>
@@ -8441,14 +8670,14 @@
           <w:rFonts w:ascii="Liberation Serif" w:hAnsi="Liberation Serif" w:eastAsia="DejaVu Sans" w:cs="Noto Sans Arabic UI"/>
           <w:lang w:val="en-US" w:eastAsia="en-US" w:bidi="en-US"/>
         </w:rPr>
-        <w:t>Were the data from figure 3B not normalized?</w:t>
+        <w:t xml:space="preserve">Here we need AS, coverage, qscore from basecalling. Also the KPC mice need to be mentioned. </w:t>
       </w:r>
     </w:p>
   </w:comment>
-  <w:comment w:id="53" w:author="Christoph Ammer-Herrmenau" w:date="2026-04-25T22:09:00Z" w:initials="CA">
-    <w:p>
-      <w:pPr>
-        <w:overflowPunct w:val="true"/>
+  <w:comment w:id="55" w:author="Christoph Ammer-Herrmenau" w:date="2026-04-25T22:28:00Z" w:initials="CA">
+    <w:p>
+      <w:pPr>
+        <w:overflowPunct w:val="false"/>
         <w:spacing w:before="0" w:after="0"/>
         <w:rPr/>
       </w:pPr>
@@ -8457,38 +8686,6 @@
           <w:rFonts w:ascii="Liberation Serif" w:hAnsi="Liberation Serif" w:eastAsia="DejaVu Sans" w:cs="Noto Sans Arabic UI"/>
           <w:lang w:val="en-US" w:eastAsia="en-US" w:bidi="en-US"/>
         </w:rPr>
-        <w:t>Please rephrase.</w:t>
-      </w:r>
-    </w:p>
-  </w:comment>
-  <w:comment w:id="54" w:author="Christoph Ammer-Herrmenau" w:date="2026-04-25T22:24:00Z" w:initials="CA">
-    <w:p>
-      <w:pPr>
-        <w:overflowPunct w:val="true"/>
-        <w:spacing w:before="0" w:after="0"/>
-        <w:rPr/>
-      </w:pPr>
-      <w:r>
-        <w:rPr>
-          <w:rFonts w:ascii="Liberation Serif" w:hAnsi="Liberation Serif" w:eastAsia="DejaVu Sans" w:cs="Noto Sans Arabic UI"/>
-          <w:lang w:val="en-US" w:eastAsia="en-US" w:bidi="en-US"/>
-        </w:rPr>
-        <w:t xml:space="preserve">Here we need AS, coverage, qscore from basecalling. Also the KPC mice need to be mentioned. </w:t>
-      </w:r>
-    </w:p>
-  </w:comment>
-  <w:comment w:id="55" w:author="Christoph Ammer-Herrmenau" w:date="2026-04-25T22:28:00Z" w:initials="CA">
-    <w:p>
-      <w:pPr>
-        <w:overflowPunct w:val="true"/>
-        <w:spacing w:before="0" w:after="0"/>
-        <w:rPr/>
-      </w:pPr>
-      <w:r>
-        <w:rPr>
-          <w:rFonts w:ascii="Liberation Serif" w:hAnsi="Liberation Serif" w:eastAsia="DejaVu Sans" w:cs="Noto Sans Arabic UI"/>
-          <w:lang w:val="en-US" w:eastAsia="en-US" w:bidi="en-US"/>
-        </w:rPr>
         <w:t xml:space="preserve">Trp53R172H and KrasG12D cooperate to promote chromosomal instability and widely metastatic pancreatic ductal adenocarcinoma in mice </w:t>
       </w:r>
     </w:p>
@@ -8496,7 +8693,7 @@
   <w:comment w:id="56" w:author="Christoph Ammer-Herrmenau" w:date="2026-04-25T22:33:00Z" w:initials="CA">
     <w:p>
       <w:pPr>
-        <w:overflowPunct w:val="true"/>
+        <w:overflowPunct w:val="false"/>
         <w:spacing w:before="0" w:after="0"/>
         <w:rPr/>
       </w:pPr>
@@ -8544,7 +8741,7 @@
   <w:comment w:id="57" w:author="Christoph Ammer-Herrmenau" w:date="2026-04-25T22:22:00Z" w:initials="CA">
     <w:p>
       <w:pPr>
-        <w:overflowPunct w:val="true"/>
+        <w:overflowPunct w:val="false"/>
         <w:spacing w:before="0" w:after="0"/>
         <w:rPr/>
       </w:pPr>
@@ -8560,7 +8757,7 @@
   <w:comment w:id="58" w:author="Christoph Ammer-Herrmenau" w:date="2026-04-25T22:21:00Z" w:initials="CA">
     <w:p>
       <w:pPr>
-        <w:overflowPunct w:val="true"/>
+        <w:overflowPunct w:val="false"/>
         <w:spacing w:before="0" w:after="0"/>
         <w:rPr/>
       </w:pPr>
@@ -8576,7 +8773,7 @@
   <w:comment w:id="59" w:author="Christoph Ammer-Herrmenau" w:date="2026-04-25T22:34:00Z" w:initials="CA">
     <w:p>
       <w:pPr>
-        <w:overflowPunct w:val="true"/>
+        <w:overflowPunct w:val="false"/>
         <w:spacing w:before="0" w:after="0"/>
         <w:rPr/>
       </w:pPr>

</xml_diff>